<commit_message>
Update System Functionality Documentation with List Travel
</commit_message>
<xml_diff>
--- a/SystemFunctionalityDocument_fromDocs-Completed.docx
+++ b/SystemFunctionalityDocument_fromDocs-Completed.docx
@@ -1109,6 +1109,13 @@
                 <w:szCs w:val="20"/>
               </w:rPr>
             </w:pPr>
+            <w:r>
+              <w:rPr>
+                <w:sz w:val="20"/>
+                <w:szCs w:val="20"/>
+              </w:rPr>
+              <w:t>List Travel</w:t>
+            </w:r>
           </w:p>
         </w:tc>
         <w:tc>
@@ -1129,6 +1136,13 @@
                 <w:szCs w:val="20"/>
               </w:rPr>
             </w:pPr>
+            <w:r>
+              <w:rPr>
+                <w:sz w:val="20"/>
+                <w:szCs w:val="20"/>
+              </w:rPr>
+              <w:t>Gerard</w:t>
+            </w:r>
           </w:p>
         </w:tc>
       </w:tr>
@@ -1596,6 +1610,14 @@
                 <w:szCs w:val="20"/>
               </w:rPr>
             </w:pPr>
+            <w:r>
+              <w:rPr>
+                <w:b/>
+                <w:sz w:val="20"/>
+                <w:szCs w:val="20"/>
+              </w:rPr>
+              <w:t>21/08/2026</w:t>
+            </w:r>
           </w:p>
         </w:tc>
         <w:tc>
@@ -1614,6 +1636,13 @@
                 <w:szCs w:val="20"/>
               </w:rPr>
             </w:pPr>
+            <w:r>
+              <w:rPr>
+                <w:sz w:val="20"/>
+                <w:szCs w:val="20"/>
+              </w:rPr>
+              <w:t>1.1</w:t>
+            </w:r>
           </w:p>
         </w:tc>
         <w:tc>
@@ -1632,6 +1661,13 @@
                 <w:szCs w:val="20"/>
               </w:rPr>
             </w:pPr>
+            <w:r>
+              <w:rPr>
+                <w:sz w:val="20"/>
+                <w:szCs w:val="20"/>
+              </w:rPr>
+              <w:t>Gerard</w:t>
+            </w:r>
           </w:p>
         </w:tc>
         <w:tc>
@@ -1646,11 +1682,19 @@
           <w:p>
             <w:pPr>
               <w:rPr>
-                <w:b/>
+                <w:bCs/>
                 <w:sz w:val="20"/>
                 <w:szCs w:val="20"/>
               </w:rPr>
             </w:pPr>
+            <w:r>
+              <w:rPr>
+                <w:bCs/>
+                <w:sz w:val="20"/>
+                <w:szCs w:val="20"/>
+              </w:rPr>
+              <w:t>2.1, 2.4</w:t>
+            </w:r>
           </w:p>
         </w:tc>
         <w:tc>
@@ -1666,11 +1710,19 @@
           <w:p>
             <w:pPr>
               <w:rPr>
-                <w:b/>
+                <w:bCs/>
                 <w:sz w:val="20"/>
                 <w:szCs w:val="20"/>
               </w:rPr>
             </w:pPr>
+            <w:r>
+              <w:rPr>
+                <w:bCs/>
+                <w:sz w:val="20"/>
+                <w:szCs w:val="20"/>
+              </w:rPr>
+              <w:t>Added List Travel functionality</w:t>
+            </w:r>
           </w:p>
         </w:tc>
       </w:tr>
@@ -2517,7 +2569,6 @@
           <w:szCs w:val="22"/>
         </w:rPr>
       </w:pPr>
-      <w:proofErr w:type="spellStart"/>
       <w:r>
         <w:rPr>
           <w:rFonts w:eastAsia="Arial"/>
@@ -2525,17 +2576,7 @@
           <w:color w:val="000000"/>
           <w:szCs w:val="22"/>
         </w:rPr>
-        <w:t>i</w:t>
-      </w:r>
-      <w:proofErr w:type="spellEnd"/>
-      <w:r>
-        <w:rPr>
-          <w:rFonts w:eastAsia="Arial"/>
-          <w:i/>
-          <w:color w:val="000000"/>
-          <w:szCs w:val="22"/>
-        </w:rPr>
-        <w:t>) a sequence diagram of the input / output between the User, Front End (i.e. the Website) and the Backend (i.e. the Server App).</w:t>
+        <w:t>i) a sequence diagram of the input / output between the User, Front End (i.e. the Website) and the Backend (i.e. the Server App).</w:t>
       </w:r>
     </w:p>
     <w:p>
@@ -2564,27 +2605,7 @@
           <w:color w:val="000000"/>
           <w:szCs w:val="22"/>
         </w:rPr>
-        <w:t xml:space="preserve">ii) screenshots of the </w:t>
-      </w:r>
-      <w:proofErr w:type="gramStart"/>
-      <w:r>
-        <w:rPr>
-          <w:rFonts w:eastAsia="Arial"/>
-          <w:i/>
-          <w:color w:val="000000"/>
-          <w:szCs w:val="22"/>
-        </w:rPr>
-        <w:t>end to end</w:t>
-      </w:r>
-      <w:proofErr w:type="gramEnd"/>
-      <w:r>
-        <w:rPr>
-          <w:rFonts w:eastAsia="Arial"/>
-          <w:i/>
-          <w:color w:val="000000"/>
-          <w:szCs w:val="22"/>
-        </w:rPr>
-        <w:t xml:space="preserve"> process (i.e. what would be observed by the User)</w:t>
+        <w:t>ii) screenshots of the end to end process (i.e. what would be observed by the User)</w:t>
       </w:r>
     </w:p>
     <w:p>
@@ -2698,23 +2719,7 @@
           <w:b/>
           <w:lang w:val="en-SG"/>
         </w:rPr>
-        <w:t xml:space="preserve">After a successful login, administrative functions such as Add Travel and Edit Travel become available. When the administrator logs out, the authentication information is </w:t>
-      </w:r>
-      <w:proofErr w:type="gramStart"/>
-      <w:r>
-        <w:rPr>
-          <w:b/>
-          <w:lang w:val="en-SG"/>
-        </w:rPr>
-        <w:t>removed</w:t>
-      </w:r>
-      <w:proofErr w:type="gramEnd"/>
-      <w:r>
-        <w:rPr>
-          <w:b/>
-          <w:lang w:val="en-SG"/>
-        </w:rPr>
-        <w:t xml:space="preserve"> and these protected functions are hidden again.</w:t>
+        <w:t>After a successful login, administrative functions such as Add Travel and Edit Travel become available. When the administrator logs out, the authentication information is removed and these protected functions are hidden again.</w:t>
       </w:r>
     </w:p>
     <w:p>
@@ -2932,6 +2937,7 @@
         <w:rPr>
           <w:rFonts w:eastAsia="Arial"/>
           <w:iCs/>
+          <w:noProof/>
           <w:color w:val="000000"/>
           <w:szCs w:val="22"/>
         </w:rPr>
@@ -3064,6 +3070,7 @@
         <w:rPr>
           <w:rFonts w:eastAsia="Arial"/>
           <w:iCs/>
+          <w:noProof/>
           <w:color w:val="000000"/>
           <w:szCs w:val="22"/>
         </w:rPr>
@@ -3196,6 +3203,7 @@
         <w:rPr>
           <w:rFonts w:eastAsia="Arial"/>
           <w:iCs/>
+          <w:noProof/>
           <w:color w:val="000000"/>
           <w:szCs w:val="22"/>
         </w:rPr>
@@ -3328,6 +3336,7 @@
         <w:rPr>
           <w:rFonts w:eastAsia="Arial"/>
           <w:iCs/>
+          <w:noProof/>
           <w:color w:val="000000"/>
           <w:szCs w:val="22"/>
         </w:rPr>
@@ -3498,6 +3507,7 @@
       <w:r>
         <w:rPr>
           <w:b/>
+          <w:noProof/>
           <w:lang w:val="en-SG"/>
         </w:rPr>
         <w:lastRenderedPageBreak/>
@@ -3578,6 +3588,7 @@
       <w:r>
         <w:rPr>
           <w:bCs/>
+          <w:noProof/>
           <w:lang w:val="en-SG"/>
         </w:rPr>
         <w:drawing>
@@ -3658,6 +3669,7 @@
       <w:r>
         <w:rPr>
           <w:bCs/>
+          <w:noProof/>
           <w:lang w:val="en-SG"/>
         </w:rPr>
         <w:drawing>
@@ -3738,6 +3750,7 @@
       <w:r>
         <w:rPr>
           <w:bCs/>
+          <w:noProof/>
           <w:lang w:val="en-SG"/>
         </w:rPr>
         <w:drawing>
@@ -4315,6 +4328,7 @@
           <w:rFonts w:eastAsia="Arial"/>
           <w:b/>
           <w:bCs/>
+          <w:noProof/>
           <w:color w:val="000000"/>
           <w:szCs w:val="22"/>
           <w:lang w:val="en-SG"/>
@@ -4431,6 +4445,7 @@
       <w:r>
         <w:rPr>
           <w:rFonts w:eastAsia="Arial"/>
+          <w:noProof/>
           <w:color w:val="000000"/>
           <w:szCs w:val="22"/>
           <w:lang w:val="en-SG"/>
@@ -4556,6 +4571,7 @@
       <w:r>
         <w:rPr>
           <w:rFonts w:eastAsia="Arial"/>
+          <w:noProof/>
           <w:color w:val="000000"/>
           <w:szCs w:val="22"/>
           <w:lang w:val="en-SG"/>
@@ -4673,6 +4689,7 @@
       <w:r>
         <w:rPr>
           <w:rFonts w:eastAsia="Arial"/>
+          <w:noProof/>
           <w:color w:val="000000"/>
           <w:szCs w:val="22"/>
           <w:lang w:val="en-SG"/>
@@ -5073,6 +5090,1421 @@
     </w:p>
     <w:p>
       <w:pPr>
+        <w:pBdr>
+          <w:top w:val="nil"/>
+          <w:left w:val="nil"/>
+          <w:bottom w:val="nil"/>
+          <w:right w:val="nil"/>
+          <w:between w:val="nil"/>
+        </w:pBdr>
+        <w:rPr>
+          <w:rFonts w:eastAsia="Arial"/>
+          <w:color w:val="000000"/>
+          <w:szCs w:val="22"/>
+          <w:lang w:val="en-SG"/>
+        </w:rPr>
+      </w:pPr>
+    </w:p>
+    <w:p>
+      <w:pPr>
+        <w:pBdr>
+          <w:top w:val="nil"/>
+          <w:left w:val="nil"/>
+          <w:bottom w:val="nil"/>
+          <w:right w:val="nil"/>
+          <w:between w:val="nil"/>
+        </w:pBdr>
+        <w:rPr>
+          <w:rFonts w:eastAsia="Arial"/>
+          <w:color w:val="000000"/>
+          <w:szCs w:val="22"/>
+          <w:lang w:val="en-SG"/>
+        </w:rPr>
+      </w:pPr>
+    </w:p>
+    <w:p>
+      <w:pPr>
+        <w:pBdr>
+          <w:top w:val="nil"/>
+          <w:left w:val="nil"/>
+          <w:bottom w:val="nil"/>
+          <w:right w:val="nil"/>
+          <w:between w:val="nil"/>
+        </w:pBdr>
+        <w:rPr>
+          <w:rFonts w:eastAsia="Arial"/>
+          <w:color w:val="000000"/>
+          <w:szCs w:val="22"/>
+          <w:lang w:val="en-SG"/>
+        </w:rPr>
+      </w:pPr>
+    </w:p>
+    <w:p>
+      <w:pPr>
+        <w:pBdr>
+          <w:top w:val="nil"/>
+          <w:left w:val="nil"/>
+          <w:bottom w:val="nil"/>
+          <w:right w:val="nil"/>
+          <w:between w:val="nil"/>
+        </w:pBdr>
+        <w:rPr>
+          <w:rFonts w:eastAsia="Arial"/>
+          <w:b/>
+          <w:bCs/>
+          <w:color w:val="000000"/>
+          <w:szCs w:val="22"/>
+          <w:lang w:val="en-SG"/>
+        </w:rPr>
+      </w:pPr>
+      <w:r>
+        <w:rPr>
+          <w:rFonts w:eastAsia="Arial"/>
+          <w:b/>
+          <w:bCs/>
+          <w:color w:val="000000"/>
+          <w:szCs w:val="22"/>
+          <w:lang w:val="en-SG"/>
+        </w:rPr>
+        <w:t>List Travel</w:t>
+      </w:r>
+    </w:p>
+    <w:p>
+      <w:pPr>
+        <w:pBdr>
+          <w:top w:val="nil"/>
+          <w:left w:val="nil"/>
+          <w:bottom w:val="nil"/>
+          <w:right w:val="nil"/>
+          <w:between w:val="nil"/>
+        </w:pBdr>
+        <w:rPr>
+          <w:rFonts w:eastAsia="Arial"/>
+          <w:b/>
+          <w:bCs/>
+          <w:color w:val="000000"/>
+          <w:szCs w:val="22"/>
+          <w:lang w:val="en-SG"/>
+        </w:rPr>
+      </w:pPr>
+    </w:p>
+    <w:p>
+      <w:pPr>
+        <w:pBdr>
+          <w:top w:val="nil"/>
+          <w:left w:val="nil"/>
+          <w:bottom w:val="nil"/>
+          <w:right w:val="nil"/>
+          <w:between w:val="nil"/>
+        </w:pBdr>
+        <w:rPr>
+          <w:rFonts w:eastAsia="Arial"/>
+          <w:b/>
+          <w:bCs/>
+          <w:color w:val="000000"/>
+          <w:szCs w:val="22"/>
+          <w:lang w:val="en-SG"/>
+        </w:rPr>
+      </w:pPr>
+      <w:r>
+        <w:rPr>
+          <w:rFonts w:eastAsia="Arial"/>
+          <w:b/>
+          <w:bCs/>
+          <w:color w:val="000000"/>
+          <w:szCs w:val="22"/>
+          <w:lang w:val="en-SG"/>
+        </w:rPr>
+        <w:t>The List Travel function allows users to view the travel packages currently stored in the SP Travel database. When the Home page loads, the frontend sends a request to the backend to retrieve all available travel packages.</w:t>
+      </w:r>
+    </w:p>
+    <w:p>
+      <w:pPr>
+        <w:pBdr>
+          <w:top w:val="nil"/>
+          <w:left w:val="nil"/>
+          <w:bottom w:val="nil"/>
+          <w:right w:val="nil"/>
+          <w:between w:val="nil"/>
+        </w:pBdr>
+        <w:rPr>
+          <w:rFonts w:eastAsia="Arial"/>
+          <w:b/>
+          <w:bCs/>
+          <w:color w:val="000000"/>
+          <w:szCs w:val="22"/>
+          <w:lang w:val="en-SG"/>
+        </w:rPr>
+      </w:pPr>
+    </w:p>
+    <w:p>
+      <w:pPr>
+        <w:pBdr>
+          <w:top w:val="nil"/>
+          <w:left w:val="nil"/>
+          <w:bottom w:val="nil"/>
+          <w:right w:val="nil"/>
+          <w:between w:val="nil"/>
+        </w:pBdr>
+        <w:rPr>
+          <w:rFonts w:eastAsia="Arial"/>
+          <w:b/>
+          <w:bCs/>
+          <w:color w:val="000000"/>
+          <w:szCs w:val="22"/>
+          <w:lang w:val="en-SG"/>
+        </w:rPr>
+      </w:pPr>
+      <w:r>
+        <w:rPr>
+          <w:rFonts w:eastAsia="Arial"/>
+          <w:b/>
+          <w:bCs/>
+          <w:color w:val="000000"/>
+          <w:szCs w:val="22"/>
+          <w:lang w:val="en-SG"/>
+        </w:rPr>
+        <w:t>The backend retrieves the travel package records from the database and returns them to the frontend. The returned data includes information such as the travel ID, title, country, price, description, travel period and image URL.</w:t>
+      </w:r>
+    </w:p>
+    <w:p>
+      <w:pPr>
+        <w:pBdr>
+          <w:top w:val="nil"/>
+          <w:left w:val="nil"/>
+          <w:bottom w:val="nil"/>
+          <w:right w:val="nil"/>
+          <w:between w:val="nil"/>
+        </w:pBdr>
+        <w:rPr>
+          <w:rFonts w:eastAsia="Arial"/>
+          <w:b/>
+          <w:bCs/>
+          <w:color w:val="000000"/>
+          <w:szCs w:val="22"/>
+          <w:lang w:val="en-SG"/>
+        </w:rPr>
+      </w:pPr>
+    </w:p>
+    <w:p>
+      <w:pPr>
+        <w:pBdr>
+          <w:top w:val="nil"/>
+          <w:left w:val="nil"/>
+          <w:bottom w:val="nil"/>
+          <w:right w:val="nil"/>
+          <w:between w:val="nil"/>
+        </w:pBdr>
+        <w:rPr>
+          <w:rFonts w:eastAsia="Arial"/>
+          <w:b/>
+          <w:bCs/>
+          <w:color w:val="000000"/>
+          <w:szCs w:val="22"/>
+          <w:lang w:val="en-SG"/>
+        </w:rPr>
+      </w:pPr>
+      <w:r>
+        <w:rPr>
+          <w:rFonts w:eastAsia="Arial"/>
+          <w:b/>
+          <w:bCs/>
+          <w:color w:val="000000"/>
+          <w:szCs w:val="22"/>
+          <w:lang w:val="en-SG"/>
+        </w:rPr>
+        <w:t>The frontend stores the returned travel packages in the Redux application state and displays them as travel package cards. This ensures that the travel listings shown on the website are loaded from the database and remain available after the page is refreshed.</w:t>
+      </w:r>
+    </w:p>
+    <w:p>
+      <w:pPr>
+        <w:pBdr>
+          <w:top w:val="nil"/>
+          <w:left w:val="nil"/>
+          <w:bottom w:val="nil"/>
+          <w:right w:val="nil"/>
+          <w:between w:val="nil"/>
+        </w:pBdr>
+        <w:rPr>
+          <w:rFonts w:eastAsia="Arial"/>
+          <w:b/>
+          <w:bCs/>
+          <w:color w:val="000000"/>
+          <w:szCs w:val="22"/>
+          <w:lang w:val="en-SG"/>
+        </w:rPr>
+      </w:pPr>
+    </w:p>
+    <w:p>
+      <w:pPr>
+        <w:pBdr>
+          <w:top w:val="nil"/>
+          <w:left w:val="nil"/>
+          <w:bottom w:val="nil"/>
+          <w:right w:val="nil"/>
+          <w:between w:val="nil"/>
+        </w:pBdr>
+        <w:rPr>
+          <w:rFonts w:eastAsia="Arial"/>
+          <w:b/>
+          <w:bCs/>
+          <w:color w:val="000000"/>
+          <w:szCs w:val="22"/>
+          <w:lang w:val="en-SG"/>
+        </w:rPr>
+      </w:pPr>
+    </w:p>
+    <w:p>
+      <w:pPr>
+        <w:pBdr>
+          <w:top w:val="nil"/>
+          <w:left w:val="nil"/>
+          <w:bottom w:val="nil"/>
+          <w:right w:val="nil"/>
+          <w:between w:val="nil"/>
+        </w:pBdr>
+        <w:rPr>
+          <w:rFonts w:eastAsia="Arial"/>
+          <w:b/>
+          <w:bCs/>
+          <w:color w:val="000000"/>
+          <w:szCs w:val="22"/>
+          <w:lang w:val="en-SG"/>
+        </w:rPr>
+      </w:pPr>
+    </w:p>
+    <w:p>
+      <w:pPr>
+        <w:pBdr>
+          <w:top w:val="nil"/>
+          <w:left w:val="nil"/>
+          <w:bottom w:val="nil"/>
+          <w:right w:val="nil"/>
+          <w:between w:val="nil"/>
+        </w:pBdr>
+        <w:rPr>
+          <w:rFonts w:eastAsia="Arial"/>
+          <w:b/>
+          <w:bCs/>
+          <w:color w:val="000000"/>
+          <w:szCs w:val="22"/>
+          <w:lang w:val="en-SG"/>
+        </w:rPr>
+      </w:pPr>
+    </w:p>
+    <w:p>
+      <w:pPr>
+        <w:pBdr>
+          <w:top w:val="nil"/>
+          <w:left w:val="nil"/>
+          <w:bottom w:val="nil"/>
+          <w:right w:val="nil"/>
+          <w:between w:val="nil"/>
+        </w:pBdr>
+        <w:rPr>
+          <w:rFonts w:eastAsia="Arial"/>
+          <w:b/>
+          <w:bCs/>
+          <w:color w:val="000000"/>
+          <w:szCs w:val="22"/>
+          <w:lang w:val="en-SG"/>
+        </w:rPr>
+      </w:pPr>
+    </w:p>
+    <w:p>
+      <w:pPr>
+        <w:pBdr>
+          <w:top w:val="nil"/>
+          <w:left w:val="nil"/>
+          <w:bottom w:val="nil"/>
+          <w:right w:val="nil"/>
+          <w:between w:val="nil"/>
+        </w:pBdr>
+        <w:rPr>
+          <w:rFonts w:eastAsia="Arial"/>
+          <w:b/>
+          <w:bCs/>
+          <w:color w:val="000000"/>
+          <w:szCs w:val="22"/>
+          <w:lang w:val="en-SG"/>
+        </w:rPr>
+      </w:pPr>
+    </w:p>
+    <w:p>
+      <w:pPr>
+        <w:pBdr>
+          <w:top w:val="nil"/>
+          <w:left w:val="nil"/>
+          <w:bottom w:val="nil"/>
+          <w:right w:val="nil"/>
+          <w:between w:val="nil"/>
+        </w:pBdr>
+        <w:rPr>
+          <w:rFonts w:eastAsia="Arial"/>
+          <w:b/>
+          <w:bCs/>
+          <w:color w:val="000000"/>
+          <w:szCs w:val="22"/>
+          <w:lang w:val="en-SG"/>
+        </w:rPr>
+      </w:pPr>
+    </w:p>
+    <w:p>
+      <w:pPr>
+        <w:pBdr>
+          <w:top w:val="nil"/>
+          <w:left w:val="nil"/>
+          <w:bottom w:val="nil"/>
+          <w:right w:val="nil"/>
+          <w:between w:val="nil"/>
+        </w:pBdr>
+        <w:rPr>
+          <w:rFonts w:eastAsia="Arial"/>
+          <w:b/>
+          <w:bCs/>
+          <w:color w:val="000000"/>
+          <w:szCs w:val="22"/>
+          <w:lang w:val="en-SG"/>
+        </w:rPr>
+      </w:pPr>
+    </w:p>
+    <w:p>
+      <w:pPr>
+        <w:pBdr>
+          <w:top w:val="nil"/>
+          <w:left w:val="nil"/>
+          <w:bottom w:val="nil"/>
+          <w:right w:val="nil"/>
+          <w:between w:val="nil"/>
+        </w:pBdr>
+        <w:rPr>
+          <w:rFonts w:eastAsia="Arial"/>
+          <w:b/>
+          <w:bCs/>
+          <w:color w:val="000000"/>
+          <w:szCs w:val="22"/>
+          <w:lang w:val="en-SG"/>
+        </w:rPr>
+      </w:pPr>
+    </w:p>
+    <w:p>
+      <w:pPr>
+        <w:pBdr>
+          <w:top w:val="nil"/>
+          <w:left w:val="nil"/>
+          <w:bottom w:val="nil"/>
+          <w:right w:val="nil"/>
+          <w:between w:val="nil"/>
+        </w:pBdr>
+        <w:rPr>
+          <w:rFonts w:eastAsia="Arial"/>
+          <w:b/>
+          <w:bCs/>
+          <w:color w:val="000000"/>
+          <w:szCs w:val="22"/>
+          <w:lang w:val="en-SG"/>
+        </w:rPr>
+      </w:pPr>
+    </w:p>
+    <w:p>
+      <w:pPr>
+        <w:pBdr>
+          <w:top w:val="nil"/>
+          <w:left w:val="nil"/>
+          <w:bottom w:val="nil"/>
+          <w:right w:val="nil"/>
+          <w:between w:val="nil"/>
+        </w:pBdr>
+        <w:rPr>
+          <w:rFonts w:eastAsia="Arial"/>
+          <w:b/>
+          <w:bCs/>
+          <w:color w:val="000000"/>
+          <w:szCs w:val="22"/>
+          <w:lang w:val="en-SG"/>
+        </w:rPr>
+      </w:pPr>
+    </w:p>
+    <w:p>
+      <w:pPr>
+        <w:pBdr>
+          <w:top w:val="nil"/>
+          <w:left w:val="nil"/>
+          <w:bottom w:val="nil"/>
+          <w:right w:val="nil"/>
+          <w:between w:val="nil"/>
+        </w:pBdr>
+        <w:rPr>
+          <w:rFonts w:eastAsia="Arial"/>
+          <w:b/>
+          <w:bCs/>
+          <w:color w:val="000000"/>
+          <w:szCs w:val="22"/>
+          <w:lang w:val="en-SG"/>
+        </w:rPr>
+      </w:pPr>
+    </w:p>
+    <w:p>
+      <w:pPr>
+        <w:pBdr>
+          <w:top w:val="nil"/>
+          <w:left w:val="nil"/>
+          <w:bottom w:val="nil"/>
+          <w:right w:val="nil"/>
+          <w:between w:val="nil"/>
+        </w:pBdr>
+        <w:rPr>
+          <w:rFonts w:eastAsia="Arial"/>
+          <w:b/>
+          <w:bCs/>
+          <w:color w:val="000000"/>
+          <w:szCs w:val="22"/>
+          <w:lang w:val="en-SG"/>
+        </w:rPr>
+      </w:pPr>
+    </w:p>
+    <w:p>
+      <w:pPr>
+        <w:pBdr>
+          <w:top w:val="nil"/>
+          <w:left w:val="nil"/>
+          <w:bottom w:val="nil"/>
+          <w:right w:val="nil"/>
+          <w:between w:val="nil"/>
+        </w:pBdr>
+        <w:rPr>
+          <w:rFonts w:eastAsia="Arial"/>
+          <w:b/>
+          <w:bCs/>
+          <w:color w:val="000000"/>
+          <w:szCs w:val="22"/>
+          <w:lang w:val="en-SG"/>
+        </w:rPr>
+      </w:pPr>
+    </w:p>
+    <w:p>
+      <w:pPr>
+        <w:pBdr>
+          <w:top w:val="nil"/>
+          <w:left w:val="nil"/>
+          <w:bottom w:val="nil"/>
+          <w:right w:val="nil"/>
+          <w:between w:val="nil"/>
+        </w:pBdr>
+        <w:rPr>
+          <w:rFonts w:eastAsia="Arial"/>
+          <w:b/>
+          <w:bCs/>
+          <w:color w:val="000000"/>
+          <w:szCs w:val="22"/>
+          <w:lang w:val="en-SG"/>
+        </w:rPr>
+      </w:pPr>
+    </w:p>
+    <w:p>
+      <w:pPr>
+        <w:pBdr>
+          <w:top w:val="nil"/>
+          <w:left w:val="nil"/>
+          <w:bottom w:val="nil"/>
+          <w:right w:val="nil"/>
+          <w:between w:val="nil"/>
+        </w:pBdr>
+        <w:rPr>
+          <w:rFonts w:eastAsia="Arial"/>
+          <w:b/>
+          <w:bCs/>
+          <w:color w:val="000000"/>
+          <w:szCs w:val="22"/>
+          <w:lang w:val="en-SG"/>
+        </w:rPr>
+      </w:pPr>
+    </w:p>
+    <w:p>
+      <w:pPr>
+        <w:pBdr>
+          <w:top w:val="nil"/>
+          <w:left w:val="nil"/>
+          <w:bottom w:val="nil"/>
+          <w:right w:val="nil"/>
+          <w:between w:val="nil"/>
+        </w:pBdr>
+        <w:rPr>
+          <w:rFonts w:eastAsia="Arial"/>
+          <w:b/>
+          <w:bCs/>
+          <w:color w:val="000000"/>
+          <w:szCs w:val="22"/>
+          <w:lang w:val="en-SG"/>
+        </w:rPr>
+      </w:pPr>
+    </w:p>
+    <w:p>
+      <w:pPr>
+        <w:pBdr>
+          <w:top w:val="nil"/>
+          <w:left w:val="nil"/>
+          <w:bottom w:val="nil"/>
+          <w:right w:val="nil"/>
+          <w:between w:val="nil"/>
+        </w:pBdr>
+        <w:rPr>
+          <w:rFonts w:eastAsia="Arial"/>
+          <w:b/>
+          <w:bCs/>
+          <w:color w:val="000000"/>
+          <w:szCs w:val="22"/>
+          <w:lang w:val="en-SG"/>
+        </w:rPr>
+      </w:pPr>
+    </w:p>
+    <w:p>
+      <w:pPr>
+        <w:pBdr>
+          <w:top w:val="nil"/>
+          <w:left w:val="nil"/>
+          <w:bottom w:val="nil"/>
+          <w:right w:val="nil"/>
+          <w:between w:val="nil"/>
+        </w:pBdr>
+        <w:rPr>
+          <w:rFonts w:eastAsia="Arial"/>
+          <w:b/>
+          <w:bCs/>
+          <w:color w:val="000000"/>
+          <w:szCs w:val="22"/>
+          <w:lang w:val="en-SG"/>
+        </w:rPr>
+      </w:pPr>
+    </w:p>
+    <w:p>
+      <w:pPr>
+        <w:pBdr>
+          <w:top w:val="nil"/>
+          <w:left w:val="nil"/>
+          <w:bottom w:val="nil"/>
+          <w:right w:val="nil"/>
+          <w:between w:val="nil"/>
+        </w:pBdr>
+        <w:rPr>
+          <w:rFonts w:eastAsia="Arial"/>
+          <w:b/>
+          <w:bCs/>
+          <w:color w:val="000000"/>
+          <w:szCs w:val="22"/>
+          <w:lang w:val="en-SG"/>
+        </w:rPr>
+      </w:pPr>
+    </w:p>
+    <w:p>
+      <w:pPr>
+        <w:pBdr>
+          <w:top w:val="nil"/>
+          <w:left w:val="nil"/>
+          <w:bottom w:val="nil"/>
+          <w:right w:val="nil"/>
+          <w:between w:val="nil"/>
+        </w:pBdr>
+        <w:rPr>
+          <w:rFonts w:eastAsia="Arial"/>
+          <w:b/>
+          <w:bCs/>
+          <w:color w:val="000000"/>
+          <w:szCs w:val="22"/>
+          <w:lang w:val="en-SG"/>
+        </w:rPr>
+      </w:pPr>
+    </w:p>
+    <w:p>
+      <w:pPr>
+        <w:pBdr>
+          <w:top w:val="nil"/>
+          <w:left w:val="nil"/>
+          <w:bottom w:val="nil"/>
+          <w:right w:val="nil"/>
+          <w:between w:val="nil"/>
+        </w:pBdr>
+        <w:rPr>
+          <w:rFonts w:eastAsia="Arial"/>
+          <w:b/>
+          <w:bCs/>
+          <w:color w:val="000000"/>
+          <w:szCs w:val="22"/>
+          <w:lang w:val="en-SG"/>
+        </w:rPr>
+      </w:pPr>
+    </w:p>
+    <w:p>
+      <w:pPr>
+        <w:pBdr>
+          <w:top w:val="nil"/>
+          <w:left w:val="nil"/>
+          <w:bottom w:val="nil"/>
+          <w:right w:val="nil"/>
+          <w:between w:val="nil"/>
+        </w:pBdr>
+        <w:rPr>
+          <w:rFonts w:eastAsia="Arial"/>
+          <w:b/>
+          <w:bCs/>
+          <w:color w:val="000000"/>
+          <w:szCs w:val="22"/>
+          <w:lang w:val="en-SG"/>
+        </w:rPr>
+      </w:pPr>
+    </w:p>
+    <w:p>
+      <w:pPr>
+        <w:pBdr>
+          <w:top w:val="nil"/>
+          <w:left w:val="nil"/>
+          <w:bottom w:val="nil"/>
+          <w:right w:val="nil"/>
+          <w:between w:val="nil"/>
+        </w:pBdr>
+        <w:rPr>
+          <w:rFonts w:eastAsia="Arial"/>
+          <w:b/>
+          <w:bCs/>
+          <w:color w:val="000000"/>
+          <w:szCs w:val="22"/>
+          <w:lang w:val="en-SG"/>
+        </w:rPr>
+      </w:pPr>
+    </w:p>
+    <w:p>
+      <w:pPr>
+        <w:pBdr>
+          <w:top w:val="nil"/>
+          <w:left w:val="nil"/>
+          <w:bottom w:val="nil"/>
+          <w:right w:val="nil"/>
+          <w:between w:val="nil"/>
+        </w:pBdr>
+        <w:rPr>
+          <w:rFonts w:eastAsia="Arial"/>
+          <w:b/>
+          <w:bCs/>
+          <w:color w:val="000000"/>
+          <w:szCs w:val="22"/>
+          <w:lang w:val="en-SG"/>
+        </w:rPr>
+      </w:pPr>
+    </w:p>
+    <w:p>
+      <w:pPr>
+        <w:pBdr>
+          <w:top w:val="nil"/>
+          <w:left w:val="nil"/>
+          <w:bottom w:val="nil"/>
+          <w:right w:val="nil"/>
+          <w:between w:val="nil"/>
+        </w:pBdr>
+        <w:rPr>
+          <w:rFonts w:eastAsia="Arial"/>
+          <w:b/>
+          <w:bCs/>
+          <w:color w:val="000000"/>
+          <w:szCs w:val="22"/>
+          <w:lang w:val="en-SG"/>
+        </w:rPr>
+      </w:pPr>
+    </w:p>
+    <w:p>
+      <w:pPr>
+        <w:pBdr>
+          <w:top w:val="nil"/>
+          <w:left w:val="nil"/>
+          <w:bottom w:val="nil"/>
+          <w:right w:val="nil"/>
+          <w:between w:val="nil"/>
+        </w:pBdr>
+        <w:rPr>
+          <w:rFonts w:eastAsia="Arial"/>
+          <w:b/>
+          <w:bCs/>
+          <w:color w:val="000000"/>
+          <w:szCs w:val="22"/>
+          <w:lang w:val="en-SG"/>
+        </w:rPr>
+      </w:pPr>
+    </w:p>
+    <w:p>
+      <w:pPr>
+        <w:pBdr>
+          <w:top w:val="nil"/>
+          <w:left w:val="nil"/>
+          <w:bottom w:val="nil"/>
+          <w:right w:val="nil"/>
+          <w:between w:val="nil"/>
+        </w:pBdr>
+        <w:rPr>
+          <w:rFonts w:eastAsia="Arial"/>
+          <w:b/>
+          <w:bCs/>
+          <w:color w:val="000000"/>
+          <w:szCs w:val="22"/>
+          <w:lang w:val="en-SG"/>
+        </w:rPr>
+      </w:pPr>
+    </w:p>
+    <w:p>
+      <w:pPr>
+        <w:pBdr>
+          <w:top w:val="nil"/>
+          <w:left w:val="nil"/>
+          <w:bottom w:val="nil"/>
+          <w:right w:val="nil"/>
+          <w:between w:val="nil"/>
+        </w:pBdr>
+        <w:rPr>
+          <w:rFonts w:eastAsia="Arial"/>
+          <w:b/>
+          <w:bCs/>
+          <w:color w:val="000000"/>
+          <w:szCs w:val="22"/>
+          <w:lang w:val="en-SG"/>
+        </w:rPr>
+      </w:pPr>
+    </w:p>
+    <w:p>
+      <w:pPr>
+        <w:pBdr>
+          <w:top w:val="nil"/>
+          <w:left w:val="nil"/>
+          <w:bottom w:val="nil"/>
+          <w:right w:val="nil"/>
+          <w:between w:val="nil"/>
+        </w:pBdr>
+        <w:rPr>
+          <w:rFonts w:eastAsia="Arial"/>
+          <w:b/>
+          <w:bCs/>
+          <w:color w:val="000000"/>
+          <w:szCs w:val="22"/>
+          <w:lang w:val="en-SG"/>
+        </w:rPr>
+      </w:pPr>
+    </w:p>
+    <w:p>
+      <w:pPr>
+        <w:pBdr>
+          <w:top w:val="nil"/>
+          <w:left w:val="nil"/>
+          <w:bottom w:val="nil"/>
+          <w:right w:val="nil"/>
+          <w:between w:val="nil"/>
+        </w:pBdr>
+        <w:rPr>
+          <w:rFonts w:eastAsia="Arial"/>
+          <w:b/>
+          <w:bCs/>
+          <w:color w:val="000000"/>
+          <w:szCs w:val="22"/>
+          <w:lang w:val="en-SG"/>
+        </w:rPr>
+      </w:pPr>
+    </w:p>
+    <w:p>
+      <w:pPr>
+        <w:pBdr>
+          <w:top w:val="nil"/>
+          <w:left w:val="nil"/>
+          <w:bottom w:val="nil"/>
+          <w:right w:val="nil"/>
+          <w:between w:val="nil"/>
+        </w:pBdr>
+        <w:rPr>
+          <w:rFonts w:eastAsia="Arial"/>
+          <w:b/>
+          <w:bCs/>
+          <w:color w:val="000000"/>
+          <w:szCs w:val="22"/>
+          <w:lang w:val="en-SG"/>
+        </w:rPr>
+      </w:pPr>
+      <w:r>
+        <w:rPr>
+          <w:rFonts w:eastAsia="Arial"/>
+          <w:b/>
+          <w:bCs/>
+          <w:noProof/>
+          <w:color w:val="000000"/>
+          <w:szCs w:val="22"/>
+          <w:lang w:val="en-SG"/>
+        </w:rPr>
+        <w:lastRenderedPageBreak/>
+        <w:drawing>
+          <wp:inline distT="0" distB="0" distL="0" distR="0" wp14:anchorId="1AC6C294" wp14:editId="776B9B66">
+            <wp:extent cx="5759450" cy="7904480"/>
+            <wp:effectExtent l="0" t="0" r="0" b="1270"/>
+            <wp:docPr id="1983323791" name="Graphic 1"/>
+            <wp:cNvGraphicFramePr>
+              <a:graphicFrameLocks xmlns:a="http://schemas.openxmlformats.org/drawingml/2006/main" noChangeAspect="1"/>
+            </wp:cNvGraphicFramePr>
+            <a:graphic xmlns:a="http://schemas.openxmlformats.org/drawingml/2006/main">
+              <a:graphicData uri="http://schemas.openxmlformats.org/drawingml/2006/picture">
+                <pic:pic xmlns:pic="http://schemas.openxmlformats.org/drawingml/2006/picture">
+                  <pic:nvPicPr>
+                    <pic:cNvPr id="1983323791" name=""/>
+                    <pic:cNvPicPr/>
+                  </pic:nvPicPr>
+                  <pic:blipFill>
+                    <a:blip r:embed="rId29">
+                      <a:extLst>
+                        <a:ext uri="{96DAC541-7B7A-43D3-8B79-37D633B846F1}">
+                          <asvg:svgBlip xmlns:asvg="http://schemas.microsoft.com/office/drawing/2016/SVG/main" r:embed="rId30"/>
+                        </a:ext>
+                      </a:extLst>
+                    </a:blip>
+                    <a:stretch>
+                      <a:fillRect/>
+                    </a:stretch>
+                  </pic:blipFill>
+                  <pic:spPr>
+                    <a:xfrm>
+                      <a:off x="0" y="0"/>
+                      <a:ext cx="5759450" cy="7904480"/>
+                    </a:xfrm>
+                    <a:prstGeom prst="rect">
+                      <a:avLst/>
+                    </a:prstGeom>
+                  </pic:spPr>
+                </pic:pic>
+              </a:graphicData>
+            </a:graphic>
+          </wp:inline>
+        </w:drawing>
+      </w:r>
+    </w:p>
+    <w:p>
+      <w:pPr>
+        <w:pBdr>
+          <w:top w:val="nil"/>
+          <w:left w:val="nil"/>
+          <w:bottom w:val="nil"/>
+          <w:right w:val="nil"/>
+          <w:between w:val="nil"/>
+        </w:pBdr>
+        <w:rPr>
+          <w:rFonts w:eastAsia="Arial"/>
+          <w:b/>
+          <w:bCs/>
+          <w:color w:val="000000"/>
+          <w:szCs w:val="22"/>
+          <w:lang w:val="en-SG"/>
+        </w:rPr>
+      </w:pPr>
+    </w:p>
+    <w:p>
+      <w:pPr>
+        <w:pBdr>
+          <w:top w:val="nil"/>
+          <w:left w:val="nil"/>
+          <w:bottom w:val="nil"/>
+          <w:right w:val="nil"/>
+          <w:between w:val="nil"/>
+        </w:pBdr>
+        <w:rPr>
+          <w:rFonts w:eastAsia="Arial"/>
+          <w:b/>
+          <w:bCs/>
+          <w:color w:val="000000"/>
+          <w:szCs w:val="22"/>
+          <w:lang w:val="en-SG"/>
+        </w:rPr>
+      </w:pPr>
+    </w:p>
+    <w:p>
+      <w:pPr>
+        <w:pBdr>
+          <w:top w:val="nil"/>
+          <w:left w:val="nil"/>
+          <w:bottom w:val="nil"/>
+          <w:right w:val="nil"/>
+          <w:between w:val="nil"/>
+        </w:pBdr>
+        <w:rPr>
+          <w:rFonts w:eastAsia="Arial"/>
+          <w:b/>
+          <w:bCs/>
+          <w:color w:val="000000"/>
+          <w:szCs w:val="22"/>
+          <w:lang w:val="en-SG"/>
+        </w:rPr>
+      </w:pPr>
+    </w:p>
+    <w:p>
+      <w:pPr>
+        <w:pBdr>
+          <w:top w:val="nil"/>
+          <w:left w:val="nil"/>
+          <w:bottom w:val="nil"/>
+          <w:right w:val="nil"/>
+          <w:between w:val="nil"/>
+        </w:pBdr>
+        <w:rPr>
+          <w:rFonts w:eastAsia="Arial"/>
+          <w:b/>
+          <w:bCs/>
+          <w:color w:val="000000"/>
+          <w:szCs w:val="22"/>
+          <w:lang w:val="en-SG"/>
+        </w:rPr>
+      </w:pPr>
+    </w:p>
+    <w:p>
+      <w:pPr>
+        <w:pBdr>
+          <w:top w:val="nil"/>
+          <w:left w:val="nil"/>
+          <w:bottom w:val="nil"/>
+          <w:right w:val="nil"/>
+          <w:between w:val="nil"/>
+        </w:pBdr>
+        <w:rPr>
+          <w:rFonts w:eastAsia="Arial"/>
+          <w:b/>
+          <w:bCs/>
+          <w:color w:val="000000"/>
+          <w:szCs w:val="22"/>
+          <w:lang w:val="en-SG"/>
+        </w:rPr>
+      </w:pPr>
+    </w:p>
+    <w:p>
+      <w:pPr>
+        <w:pBdr>
+          <w:top w:val="nil"/>
+          <w:left w:val="nil"/>
+          <w:bottom w:val="nil"/>
+          <w:right w:val="nil"/>
+          <w:between w:val="nil"/>
+        </w:pBdr>
+        <w:rPr>
+          <w:rFonts w:eastAsia="Arial"/>
+          <w:color w:val="000000"/>
+          <w:szCs w:val="22"/>
+          <w:lang w:val="en-SG"/>
+        </w:rPr>
+      </w:pPr>
+      <w:r>
+        <w:rPr>
+          <w:rFonts w:eastAsia="Arial"/>
+          <w:color w:val="000000"/>
+          <w:szCs w:val="22"/>
+        </w:rPr>
+        <w:lastRenderedPageBreak/>
+        <w:t>Travel listings displayed on the Homepage match the records stored in RDS</w:t>
+      </w:r>
+      <w:r>
+        <w:rPr>
+          <w:rFonts w:eastAsia="Arial"/>
+          <w:color w:val="000000"/>
+          <w:szCs w:val="22"/>
+          <w:lang w:val="en-SG"/>
+        </w:rPr>
+        <w:t>:</w:t>
+      </w:r>
+    </w:p>
+    <w:p>
+      <w:pPr>
+        <w:pBdr>
+          <w:top w:val="nil"/>
+          <w:left w:val="nil"/>
+          <w:bottom w:val="nil"/>
+          <w:right w:val="nil"/>
+          <w:between w:val="nil"/>
+        </w:pBdr>
+        <w:rPr>
+          <w:rFonts w:eastAsia="Arial"/>
+          <w:color w:val="000000"/>
+          <w:szCs w:val="22"/>
+          <w:lang w:val="en-SG"/>
+        </w:rPr>
+      </w:pPr>
+    </w:p>
+    <w:p>
+      <w:pPr>
+        <w:pBdr>
+          <w:top w:val="nil"/>
+          <w:left w:val="nil"/>
+          <w:bottom w:val="nil"/>
+          <w:right w:val="nil"/>
+          <w:between w:val="nil"/>
+        </w:pBdr>
+        <w:rPr>
+          <w:rFonts w:eastAsia="Arial"/>
+          <w:color w:val="000000"/>
+          <w:szCs w:val="22"/>
+          <w:lang w:val="en-SG"/>
+        </w:rPr>
+      </w:pPr>
+      <w:r>
+        <w:rPr>
+          <w:rFonts w:eastAsia="Arial"/>
+          <w:noProof/>
+          <w:color w:val="000000"/>
+          <w:szCs w:val="22"/>
+          <w:lang w:val="en-SG"/>
+        </w:rPr>
+        <w:drawing>
+          <wp:inline distT="0" distB="0" distL="0" distR="0" wp14:anchorId="164D5544" wp14:editId="12E78EAE">
+            <wp:extent cx="5759450" cy="4104640"/>
+            <wp:effectExtent l="0" t="0" r="0" b="0"/>
+            <wp:docPr id="530430181" name="Picture 1"/>
+            <wp:cNvGraphicFramePr>
+              <a:graphicFrameLocks xmlns:a="http://schemas.openxmlformats.org/drawingml/2006/main" noChangeAspect="1"/>
+            </wp:cNvGraphicFramePr>
+            <a:graphic xmlns:a="http://schemas.openxmlformats.org/drawingml/2006/main">
+              <a:graphicData uri="http://schemas.openxmlformats.org/drawingml/2006/picture">
+                <pic:pic xmlns:pic="http://schemas.openxmlformats.org/drawingml/2006/picture">
+                  <pic:nvPicPr>
+                    <pic:cNvPr id="530430181" name=""/>
+                    <pic:cNvPicPr/>
+                  </pic:nvPicPr>
+                  <pic:blipFill>
+                    <a:blip r:embed="rId31"/>
+                    <a:stretch>
+                      <a:fillRect/>
+                    </a:stretch>
+                  </pic:blipFill>
+                  <pic:spPr>
+                    <a:xfrm>
+                      <a:off x="0" y="0"/>
+                      <a:ext cx="5759450" cy="4104640"/>
+                    </a:xfrm>
+                    <a:prstGeom prst="rect">
+                      <a:avLst/>
+                    </a:prstGeom>
+                  </pic:spPr>
+                </pic:pic>
+              </a:graphicData>
+            </a:graphic>
+          </wp:inline>
+        </w:drawing>
+      </w:r>
+    </w:p>
+    <w:p>
+      <w:pPr>
+        <w:pBdr>
+          <w:top w:val="nil"/>
+          <w:left w:val="nil"/>
+          <w:bottom w:val="nil"/>
+          <w:right w:val="nil"/>
+          <w:between w:val="nil"/>
+        </w:pBdr>
+        <w:rPr>
+          <w:rFonts w:eastAsia="Arial"/>
+          <w:color w:val="000000"/>
+          <w:szCs w:val="22"/>
+          <w:lang w:val="en-SG"/>
+        </w:rPr>
+      </w:pPr>
+    </w:p>
+    <w:p>
+      <w:pPr>
+        <w:pBdr>
+          <w:top w:val="nil"/>
+          <w:left w:val="nil"/>
+          <w:bottom w:val="nil"/>
+          <w:right w:val="nil"/>
+          <w:between w:val="nil"/>
+        </w:pBdr>
+        <w:rPr>
+          <w:rFonts w:eastAsia="Arial"/>
+          <w:color w:val="000000"/>
+          <w:szCs w:val="22"/>
+          <w:lang w:val="en-SG"/>
+        </w:rPr>
+      </w:pPr>
+      <w:r>
+        <w:rPr>
+          <w:rFonts w:eastAsia="Arial"/>
+          <w:noProof/>
+          <w:color w:val="000000"/>
+          <w:szCs w:val="22"/>
+          <w:lang w:val="en-SG"/>
+        </w:rPr>
+        <w:drawing>
+          <wp:inline distT="0" distB="0" distL="0" distR="0" wp14:anchorId="178096C1" wp14:editId="28ED9A0A">
+            <wp:extent cx="5759450" cy="1480820"/>
+            <wp:effectExtent l="0" t="0" r="0" b="5080"/>
+            <wp:docPr id="269033858" name="Picture 1"/>
+            <wp:cNvGraphicFramePr>
+              <a:graphicFrameLocks xmlns:a="http://schemas.openxmlformats.org/drawingml/2006/main" noChangeAspect="1"/>
+            </wp:cNvGraphicFramePr>
+            <a:graphic xmlns:a="http://schemas.openxmlformats.org/drawingml/2006/main">
+              <a:graphicData uri="http://schemas.openxmlformats.org/drawingml/2006/picture">
+                <pic:pic xmlns:pic="http://schemas.openxmlformats.org/drawingml/2006/picture">
+                  <pic:nvPicPr>
+                    <pic:cNvPr id="269033858" name=""/>
+                    <pic:cNvPicPr/>
+                  </pic:nvPicPr>
+                  <pic:blipFill>
+                    <a:blip r:embed="rId32"/>
+                    <a:stretch>
+                      <a:fillRect/>
+                    </a:stretch>
+                  </pic:blipFill>
+                  <pic:spPr>
+                    <a:xfrm>
+                      <a:off x="0" y="0"/>
+                      <a:ext cx="5759450" cy="1480820"/>
+                    </a:xfrm>
+                    <a:prstGeom prst="rect">
+                      <a:avLst/>
+                    </a:prstGeom>
+                  </pic:spPr>
+                </pic:pic>
+              </a:graphicData>
+            </a:graphic>
+          </wp:inline>
+        </w:drawing>
+      </w:r>
+    </w:p>
+    <w:p>
+      <w:pPr>
+        <w:pBdr>
+          <w:top w:val="nil"/>
+          <w:left w:val="nil"/>
+          <w:bottom w:val="nil"/>
+          <w:right w:val="nil"/>
+          <w:between w:val="nil"/>
+        </w:pBdr>
+        <w:rPr>
+          <w:rFonts w:eastAsia="Arial"/>
+          <w:color w:val="000000"/>
+          <w:szCs w:val="22"/>
+          <w:lang w:val="en-SG"/>
+        </w:rPr>
+      </w:pPr>
+    </w:p>
+    <w:p>
+      <w:pPr>
+        <w:pBdr>
+          <w:top w:val="nil"/>
+          <w:left w:val="nil"/>
+          <w:bottom w:val="nil"/>
+          <w:right w:val="nil"/>
+          <w:between w:val="nil"/>
+        </w:pBdr>
+        <w:rPr>
+          <w:rFonts w:eastAsia="Arial"/>
+          <w:color w:val="000000"/>
+          <w:szCs w:val="22"/>
+          <w:lang w:val="en-SG"/>
+        </w:rPr>
+      </w:pPr>
+    </w:p>
+    <w:p>
+      <w:pPr>
+        <w:pBdr>
+          <w:top w:val="nil"/>
+          <w:left w:val="nil"/>
+          <w:bottom w:val="nil"/>
+          <w:right w:val="nil"/>
+          <w:between w:val="nil"/>
+        </w:pBdr>
+        <w:rPr>
+          <w:rFonts w:eastAsia="Arial"/>
+          <w:color w:val="000000"/>
+          <w:szCs w:val="22"/>
+          <w:lang w:val="en-SG"/>
+        </w:rPr>
+      </w:pPr>
+    </w:p>
+    <w:p>
+      <w:pPr>
+        <w:pBdr>
+          <w:top w:val="nil"/>
+          <w:left w:val="nil"/>
+          <w:bottom w:val="nil"/>
+          <w:right w:val="nil"/>
+          <w:between w:val="nil"/>
+        </w:pBdr>
+        <w:rPr>
+          <w:rFonts w:eastAsia="Arial"/>
+          <w:color w:val="000000"/>
+          <w:szCs w:val="22"/>
+          <w:lang w:val="en-SG"/>
+        </w:rPr>
+      </w:pPr>
+    </w:p>
+    <w:p>
+      <w:pPr>
+        <w:pBdr>
+          <w:top w:val="nil"/>
+          <w:left w:val="nil"/>
+          <w:bottom w:val="nil"/>
+          <w:right w:val="nil"/>
+          <w:between w:val="nil"/>
+        </w:pBdr>
+        <w:rPr>
+          <w:rFonts w:eastAsia="Arial"/>
+          <w:color w:val="000000"/>
+          <w:szCs w:val="22"/>
+          <w:lang w:val="en-SG"/>
+        </w:rPr>
+      </w:pPr>
+    </w:p>
+    <w:p>
+      <w:pPr>
+        <w:pBdr>
+          <w:top w:val="nil"/>
+          <w:left w:val="nil"/>
+          <w:bottom w:val="nil"/>
+          <w:right w:val="nil"/>
+          <w:between w:val="nil"/>
+        </w:pBdr>
+        <w:rPr>
+          <w:rFonts w:eastAsia="Arial"/>
+          <w:color w:val="000000"/>
+          <w:szCs w:val="22"/>
+          <w:lang w:val="en-SG"/>
+        </w:rPr>
+      </w:pPr>
+    </w:p>
+    <w:p>
+      <w:pPr>
+        <w:pBdr>
+          <w:top w:val="nil"/>
+          <w:left w:val="nil"/>
+          <w:bottom w:val="nil"/>
+          <w:right w:val="nil"/>
+          <w:between w:val="nil"/>
+        </w:pBdr>
+        <w:rPr>
+          <w:rFonts w:eastAsia="Arial"/>
+          <w:color w:val="000000"/>
+          <w:szCs w:val="22"/>
+          <w:lang w:val="en-SG"/>
+        </w:rPr>
+      </w:pPr>
+    </w:p>
+    <w:p>
+      <w:pPr>
+        <w:pBdr>
+          <w:top w:val="nil"/>
+          <w:left w:val="nil"/>
+          <w:bottom w:val="nil"/>
+          <w:right w:val="nil"/>
+          <w:between w:val="nil"/>
+        </w:pBdr>
+        <w:rPr>
+          <w:rFonts w:eastAsia="Arial"/>
+          <w:color w:val="000000"/>
+          <w:szCs w:val="22"/>
+          <w:lang w:val="en-SG"/>
+        </w:rPr>
+      </w:pPr>
+    </w:p>
+    <w:p>
+      <w:pPr>
+        <w:pBdr>
+          <w:top w:val="nil"/>
+          <w:left w:val="nil"/>
+          <w:bottom w:val="nil"/>
+          <w:right w:val="nil"/>
+          <w:between w:val="nil"/>
+        </w:pBdr>
+        <w:rPr>
+          <w:rFonts w:eastAsia="Arial"/>
+          <w:color w:val="000000"/>
+          <w:szCs w:val="22"/>
+          <w:lang w:val="en-SG"/>
+        </w:rPr>
+      </w:pPr>
+    </w:p>
+    <w:p>
+      <w:pPr>
+        <w:pBdr>
+          <w:top w:val="nil"/>
+          <w:left w:val="nil"/>
+          <w:bottom w:val="nil"/>
+          <w:right w:val="nil"/>
+          <w:between w:val="nil"/>
+        </w:pBdr>
+        <w:rPr>
+          <w:rFonts w:eastAsia="Arial"/>
+          <w:color w:val="000000"/>
+          <w:szCs w:val="22"/>
+          <w:lang w:val="en-SG"/>
+        </w:rPr>
+      </w:pPr>
+    </w:p>
+    <w:p>
+      <w:pPr>
+        <w:pBdr>
+          <w:top w:val="nil"/>
+          <w:left w:val="nil"/>
+          <w:bottom w:val="nil"/>
+          <w:right w:val="nil"/>
+          <w:between w:val="nil"/>
+        </w:pBdr>
+        <w:rPr>
+          <w:rFonts w:eastAsia="Arial"/>
+          <w:color w:val="000000"/>
+          <w:szCs w:val="22"/>
+          <w:lang w:val="en-SG"/>
+        </w:rPr>
+      </w:pPr>
+    </w:p>
+    <w:p>
+      <w:pPr>
+        <w:pBdr>
+          <w:top w:val="nil"/>
+          <w:left w:val="nil"/>
+          <w:bottom w:val="nil"/>
+          <w:right w:val="nil"/>
+          <w:between w:val="nil"/>
+        </w:pBdr>
+        <w:rPr>
+          <w:rFonts w:eastAsia="Arial"/>
+          <w:color w:val="000000"/>
+          <w:szCs w:val="22"/>
+          <w:lang w:val="en-SG"/>
+        </w:rPr>
+      </w:pPr>
+    </w:p>
+    <w:p>
+      <w:pPr>
+        <w:pBdr>
+          <w:top w:val="nil"/>
+          <w:left w:val="nil"/>
+          <w:bottom w:val="nil"/>
+          <w:right w:val="nil"/>
+          <w:between w:val="nil"/>
+        </w:pBdr>
+        <w:rPr>
+          <w:rFonts w:eastAsia="Arial"/>
+          <w:color w:val="000000"/>
+          <w:szCs w:val="22"/>
+          <w:lang w:val="en-SG"/>
+        </w:rPr>
+      </w:pPr>
+    </w:p>
+    <w:p>
+      <w:pPr>
+        <w:pBdr>
+          <w:top w:val="nil"/>
+          <w:left w:val="nil"/>
+          <w:bottom w:val="nil"/>
+          <w:right w:val="nil"/>
+          <w:between w:val="nil"/>
+        </w:pBdr>
+        <w:rPr>
+          <w:rFonts w:eastAsia="Arial"/>
+          <w:b/>
+          <w:bCs/>
+          <w:color w:val="000000"/>
+          <w:szCs w:val="22"/>
+          <w:lang w:val="en-SG"/>
+        </w:rPr>
+      </w:pPr>
+    </w:p>
+    <w:p>
+      <w:pPr>
         <w:pStyle w:val="Heading2"/>
         <w:numPr>
           <w:ilvl w:val="1"/>
@@ -5697,7 +7129,6 @@
               </w:rPr>
               <w:t xml:space="preserve">Implemented using the </w:t>
             </w:r>
-            <w:proofErr w:type="spellStart"/>
             <w:r>
               <w:rPr>
                 <w:rFonts w:ascii="Arial Unicode MS" w:hAnsi="Arial Unicode MS" w:cs="Times New Roman"/>
@@ -5708,7 +7139,6 @@
               </w:rPr>
               <w:t>jsonwebtoken</w:t>
             </w:r>
-            <w:proofErr w:type="spellEnd"/>
             <w:r>
               <w:rPr>
                 <w:rFonts w:ascii="Aptos Narrow" w:hAnsi="Aptos Narrow" w:cs="Times New Roman"/>
@@ -5746,7 +7176,6 @@
                 <w:lang w:val="en-SG"/>
               </w:rPr>
             </w:pPr>
-            <w:proofErr w:type="spellStart"/>
             <w:r>
               <w:rPr>
                 <w:rFonts w:ascii="Aptos Narrow" w:hAnsi="Aptos Narrow" w:cs="Times New Roman"/>
@@ -5756,7 +7185,6 @@
               </w:rPr>
               <w:t>bcrypt</w:t>
             </w:r>
-            <w:proofErr w:type="spellEnd"/>
           </w:p>
         </w:tc>
         <w:tc>
@@ -5946,7 +7374,6 @@
               </w:rPr>
               <w:t xml:space="preserve">Implemented using the </w:t>
             </w:r>
-            <w:proofErr w:type="spellStart"/>
             <w:r>
               <w:rPr>
                 <w:rFonts w:ascii="Arial Unicode MS" w:hAnsi="Arial Unicode MS" w:cs="Times New Roman"/>
@@ -5957,7 +7384,6 @@
               </w:rPr>
               <w:t>cors</w:t>
             </w:r>
-            <w:proofErr w:type="spellEnd"/>
             <w:r>
               <w:rPr>
                 <w:rFonts w:ascii="Aptos Narrow" w:hAnsi="Aptos Narrow" w:cs="Times New Roman"/>
@@ -5995,7 +7421,6 @@
                 <w:lang w:val="en-SG"/>
               </w:rPr>
             </w:pPr>
-            <w:proofErr w:type="spellStart"/>
             <w:r>
               <w:rPr>
                 <w:rFonts w:ascii="Aptos Narrow" w:hAnsi="Aptos Narrow" w:cs="Times New Roman"/>
@@ -6005,7 +7430,6 @@
               </w:rPr>
               <w:t>dotenv</w:t>
             </w:r>
-            <w:proofErr w:type="spellEnd"/>
           </w:p>
         </w:tc>
         <w:tc>
@@ -6066,7 +7490,6 @@
                 <w:lang w:val="en-SG"/>
               </w:rPr>
             </w:pPr>
-            <w:proofErr w:type="spellStart"/>
             <w:r>
               <w:rPr>
                 <w:rFonts w:ascii="Aptos Narrow" w:hAnsi="Aptos Narrow" w:cs="Times New Roman"/>
@@ -6076,7 +7499,6 @@
               </w:rPr>
               <w:t>esbuild</w:t>
             </w:r>
-            <w:proofErr w:type="spellEnd"/>
           </w:p>
         </w:tc>
         <w:tc>
@@ -7040,7 +8462,6 @@
               </w:rPr>
               <w:t xml:space="preserve">, </w:t>
             </w:r>
-            <w:proofErr w:type="spellStart"/>
             <w:r>
               <w:rPr>
                 <w:rFonts w:ascii="Arial Unicode MS" w:hAnsi="Arial Unicode MS" w:cs="Times New Roman"/>
@@ -7051,7 +8472,6 @@
               </w:rPr>
               <w:t>travelListing</w:t>
             </w:r>
-            <w:proofErr w:type="spellEnd"/>
             <w:r>
               <w:rPr>
                 <w:rFonts w:ascii="Aptos Narrow" w:hAnsi="Aptos Narrow" w:cs="Times New Roman"/>
@@ -7315,7 +8735,6 @@
                 <w:lang w:val="en-SG"/>
               </w:rPr>
             </w:pPr>
-            <w:proofErr w:type="spellStart"/>
             <w:r>
               <w:rPr>
                 <w:rFonts w:ascii="Aptos Narrow" w:hAnsi="Aptos Narrow" w:cs="Times New Roman"/>
@@ -7325,7 +8744,6 @@
               </w:rPr>
               <w:t>npm</w:t>
             </w:r>
-            <w:proofErr w:type="spellEnd"/>
           </w:p>
         </w:tc>
         <w:tc>
@@ -7852,15 +9270,7 @@
         </w:numPr>
       </w:pPr>
       <w:r>
-        <w:t xml:space="preserve">List all backend interfaces (incoming – data into the backend, outgoing – data out of the </w:t>
-      </w:r>
-      <w:proofErr w:type="gramStart"/>
-      <w:r>
-        <w:t>backend)  and</w:t>
-      </w:r>
-      <w:proofErr w:type="gramEnd"/>
-      <w:r>
-        <w:t xml:space="preserve"> the path to the file (and lines of code) in which they are stored in.</w:t>
+        <w:t>List all backend interfaces (incoming – data into the backend, outgoing – data out of the backend)  and the path to the file (and lines of code) in which they are stored in.</w:t>
       </w:r>
     </w:p>
     <w:p/>
@@ -7950,31 +9360,7 @@
                 <w:szCs w:val="22"/>
                 <w:lang w:val="en-SG"/>
               </w:rPr>
-              <w:t xml:space="preserve">Details of </w:t>
-            </w:r>
-            <w:proofErr w:type="gramStart"/>
-            <w:r>
-              <w:rPr>
-                <w:rFonts w:ascii="Aptos Narrow" w:hAnsi="Aptos Narrow" w:cs="Times New Roman"/>
-                <w:b/>
-                <w:bCs/>
-                <w:color w:val="000000"/>
-                <w:szCs w:val="22"/>
-                <w:lang w:val="en-SG"/>
-              </w:rPr>
-              <w:t>Front End</w:t>
-            </w:r>
-            <w:proofErr w:type="gramEnd"/>
-            <w:r>
-              <w:rPr>
-                <w:rFonts w:ascii="Aptos Narrow" w:hAnsi="Aptos Narrow" w:cs="Times New Roman"/>
-                <w:b/>
-                <w:bCs/>
-                <w:color w:val="000000"/>
-                <w:szCs w:val="22"/>
-                <w:lang w:val="en-SG"/>
-              </w:rPr>
-              <w:t xml:space="preserve"> Codes</w:t>
+              <w:t>Details of Front End Codes</w:t>
             </w:r>
           </w:p>
         </w:tc>
@@ -8117,38 +9503,7 @@
                 <w:szCs w:val="22"/>
                 <w:lang w:val="en-SG"/>
               </w:rPr>
-              <w:t xml:space="preserve">LoginForm.js (lines 16–49) – </w:t>
-            </w:r>
-            <w:proofErr w:type="spellStart"/>
-            <w:proofErr w:type="gramStart"/>
-            <w:r>
-              <w:rPr>
-                <w:rFonts w:ascii="Aptos Narrow" w:hAnsi="Aptos Narrow" w:cs="Times New Roman"/>
-                <w:color w:val="000000"/>
-                <w:szCs w:val="22"/>
-                <w:lang w:val="en-SG"/>
-              </w:rPr>
-              <w:t>handleSubmit</w:t>
-            </w:r>
-            <w:proofErr w:type="spellEnd"/>
-            <w:r>
-              <w:rPr>
-                <w:rFonts w:ascii="Aptos Narrow" w:hAnsi="Aptos Narrow" w:cs="Times New Roman"/>
-                <w:color w:val="000000"/>
-                <w:szCs w:val="22"/>
-                <w:lang w:val="en-SG"/>
-              </w:rPr>
-              <w:t>(</w:t>
-            </w:r>
-            <w:proofErr w:type="gramEnd"/>
-            <w:r>
-              <w:rPr>
-                <w:rFonts w:ascii="Aptos Narrow" w:hAnsi="Aptos Narrow" w:cs="Times New Roman"/>
-                <w:color w:val="000000"/>
-                <w:szCs w:val="22"/>
-                <w:lang w:val="en-SG"/>
-              </w:rPr>
-              <w:t>)</w:t>
+              <w:t>LoginForm.js (lines 16–49) – handleSubmit()</w:t>
             </w:r>
             <w:r>
               <w:rPr>
@@ -8167,47 +9522,7 @@
                 <w:lang w:val="en-SG"/>
               </w:rPr>
               <w:br/>
-              <w:t xml:space="preserve">authSlice.js (lines 13–23) – </w:t>
-            </w:r>
-            <w:proofErr w:type="gramStart"/>
-            <w:r>
-              <w:rPr>
-                <w:rFonts w:ascii="Aptos Narrow" w:hAnsi="Aptos Narrow" w:cs="Times New Roman"/>
-                <w:color w:val="000000"/>
-                <w:szCs w:val="22"/>
-                <w:lang w:val="en-SG"/>
-              </w:rPr>
-              <w:t>login(</w:t>
-            </w:r>
-            <w:proofErr w:type="gramEnd"/>
-            <w:r>
-              <w:rPr>
-                <w:rFonts w:ascii="Aptos Narrow" w:hAnsi="Aptos Narrow" w:cs="Times New Roman"/>
-                <w:color w:val="000000"/>
-                <w:szCs w:val="22"/>
-                <w:lang w:val="en-SG"/>
-              </w:rPr>
-              <w:t xml:space="preserve">), </w:t>
-            </w:r>
-            <w:proofErr w:type="gramStart"/>
-            <w:r>
-              <w:rPr>
-                <w:rFonts w:ascii="Aptos Narrow" w:hAnsi="Aptos Narrow" w:cs="Times New Roman"/>
-                <w:color w:val="000000"/>
-                <w:szCs w:val="22"/>
-                <w:lang w:val="en-SG"/>
-              </w:rPr>
-              <w:t>logout(</w:t>
-            </w:r>
-            <w:proofErr w:type="gramEnd"/>
-            <w:r>
-              <w:rPr>
-                <w:rFonts w:ascii="Aptos Narrow" w:hAnsi="Aptos Narrow" w:cs="Times New Roman"/>
-                <w:color w:val="000000"/>
-                <w:szCs w:val="22"/>
-                <w:lang w:val="en-SG"/>
-              </w:rPr>
-              <w:t>)</w:t>
+              <w:t>authSlice.js (lines 13–23) – login(), logout()</w:t>
             </w:r>
           </w:p>
         </w:tc>
@@ -8272,38 +9587,7 @@
                 <w:szCs w:val="22"/>
                 <w:lang w:val="en-SG"/>
               </w:rPr>
-              <w:t xml:space="preserve">userRoutes.js (lines 8–14) – </w:t>
-            </w:r>
-            <w:proofErr w:type="spellStart"/>
-            <w:proofErr w:type="gramStart"/>
-            <w:r>
-              <w:rPr>
-                <w:rFonts w:ascii="Aptos Narrow" w:hAnsi="Aptos Narrow" w:cs="Times New Roman"/>
-                <w:color w:val="000000"/>
-                <w:szCs w:val="22"/>
-                <w:lang w:val="en-SG"/>
-              </w:rPr>
-              <w:t>router.post</w:t>
-            </w:r>
-            <w:proofErr w:type="spellEnd"/>
-            <w:r>
-              <w:rPr>
-                <w:rFonts w:ascii="Aptos Narrow" w:hAnsi="Aptos Narrow" w:cs="Times New Roman"/>
-                <w:color w:val="000000"/>
-                <w:szCs w:val="22"/>
-                <w:lang w:val="en-SG"/>
-              </w:rPr>
-              <w:t>(</w:t>
-            </w:r>
-            <w:proofErr w:type="gramEnd"/>
-            <w:r>
-              <w:rPr>
-                <w:rFonts w:ascii="Aptos Narrow" w:hAnsi="Aptos Narrow" w:cs="Times New Roman"/>
-                <w:color w:val="000000"/>
-                <w:szCs w:val="22"/>
-                <w:lang w:val="en-SG"/>
-              </w:rPr>
-              <w:t>)</w:t>
+              <w:t>userRoutes.js (lines 8–14) – router.post()</w:t>
             </w:r>
             <w:r>
               <w:rPr>
@@ -8332,57 +9616,7 @@
                 <w:lang w:val="en-SG"/>
               </w:rPr>
               <w:br/>
-            </w:r>
-            <w:proofErr w:type="gramStart"/>
-            <w:r>
-              <w:rPr>
-                <w:rFonts w:ascii="Aptos Narrow" w:hAnsi="Aptos Narrow" w:cs="Times New Roman"/>
-                <w:color w:val="000000"/>
-                <w:szCs w:val="22"/>
-                <w:lang w:val="en-SG"/>
-              </w:rPr>
-              <w:t>sendToken(</w:t>
-            </w:r>
-            <w:proofErr w:type="gramEnd"/>
-            <w:r>
-              <w:rPr>
-                <w:rFonts w:ascii="Aptos Narrow" w:hAnsi="Aptos Narrow" w:cs="Times New Roman"/>
-                <w:color w:val="000000"/>
-                <w:szCs w:val="22"/>
-                <w:lang w:val="en-SG"/>
-              </w:rPr>
-              <w:t xml:space="preserve">)userModel.js (lines 3–13) – </w:t>
-            </w:r>
-            <w:proofErr w:type="spellStart"/>
-            <w:proofErr w:type="gramStart"/>
-            <w:r>
-              <w:rPr>
-                <w:rFonts w:ascii="Aptos Narrow" w:hAnsi="Aptos Narrow" w:cs="Times New Roman"/>
-                <w:color w:val="000000"/>
-                <w:szCs w:val="22"/>
-                <w:lang w:val="en-SG"/>
-              </w:rPr>
-              <w:t>selectByEmail</w:t>
-            </w:r>
-            <w:proofErr w:type="spellEnd"/>
-            <w:r>
-              <w:rPr>
-                <w:rFonts w:ascii="Aptos Narrow" w:hAnsi="Aptos Narrow" w:cs="Times New Roman"/>
-                <w:color w:val="000000"/>
-                <w:szCs w:val="22"/>
-                <w:lang w:val="en-SG"/>
-              </w:rPr>
-              <w:t>(</w:t>
-            </w:r>
-            <w:proofErr w:type="gramEnd"/>
-            <w:r>
-              <w:rPr>
-                <w:rFonts w:ascii="Aptos Narrow" w:hAnsi="Aptos Narrow" w:cs="Times New Roman"/>
-                <w:color w:val="000000"/>
-                <w:szCs w:val="22"/>
-                <w:lang w:val="en-SG"/>
-              </w:rPr>
-              <w:t>)</w:t>
+              <w:t>sendToken()</w:t>
             </w:r>
             <w:r>
               <w:rPr>
@@ -8401,38 +9635,15 @@
                 <w:lang w:val="en-SG"/>
               </w:rPr>
               <w:br/>
-              <w:t xml:space="preserve">bcryptMiddleware.js (lines 3–24) – </w:t>
-            </w:r>
-            <w:proofErr w:type="spellStart"/>
-            <w:proofErr w:type="gramStart"/>
-            <w:r>
-              <w:rPr>
-                <w:rFonts w:ascii="Aptos Narrow" w:hAnsi="Aptos Narrow" w:cs="Times New Roman"/>
-                <w:color w:val="000000"/>
-                <w:szCs w:val="22"/>
-                <w:lang w:val="en-SG"/>
-              </w:rPr>
-              <w:t>comparePassword</w:t>
-            </w:r>
-            <w:proofErr w:type="spellEnd"/>
-            <w:r>
-              <w:rPr>
-                <w:rFonts w:ascii="Aptos Narrow" w:hAnsi="Aptos Narrow" w:cs="Times New Roman"/>
-                <w:color w:val="000000"/>
-                <w:szCs w:val="22"/>
-                <w:lang w:val="en-SG"/>
-              </w:rPr>
-              <w:t>(</w:t>
-            </w:r>
-            <w:proofErr w:type="gramEnd"/>
-            <w:r>
-              <w:rPr>
-                <w:rFonts w:ascii="Aptos Narrow" w:hAnsi="Aptos Narrow" w:cs="Times New Roman"/>
-                <w:color w:val="000000"/>
-                <w:szCs w:val="22"/>
-                <w:lang w:val="en-SG"/>
-              </w:rPr>
-              <w:t>)</w:t>
+            </w:r>
+            <w:r>
+              <w:rPr>
+                <w:rFonts w:ascii="Aptos Narrow" w:hAnsi="Aptos Narrow" w:cs="Times New Roman"/>
+                <w:color w:val="000000"/>
+                <w:szCs w:val="22"/>
+                <w:lang w:val="en-SG"/>
+              </w:rPr>
+              <w:t>userModel.js (lines 3–13) – selectByEmail()</w:t>
             </w:r>
             <w:r>
               <w:rPr>
@@ -8451,38 +9662,26 @@
                 <w:lang w:val="en-SG"/>
               </w:rPr>
               <w:br/>
-              <w:t xml:space="preserve">jwtMiddleware.js (lines 3–22) – </w:t>
-            </w:r>
-            <w:proofErr w:type="spellStart"/>
-            <w:proofErr w:type="gramStart"/>
-            <w:r>
-              <w:rPr>
-                <w:rFonts w:ascii="Aptos Narrow" w:hAnsi="Aptos Narrow" w:cs="Times New Roman"/>
-                <w:color w:val="000000"/>
-                <w:szCs w:val="22"/>
-                <w:lang w:val="en-SG"/>
-              </w:rPr>
-              <w:t>generateToken</w:t>
-            </w:r>
-            <w:proofErr w:type="spellEnd"/>
-            <w:r>
-              <w:rPr>
-                <w:rFonts w:ascii="Aptos Narrow" w:hAnsi="Aptos Narrow" w:cs="Times New Roman"/>
-                <w:color w:val="000000"/>
-                <w:szCs w:val="22"/>
-                <w:lang w:val="en-SG"/>
-              </w:rPr>
-              <w:t>(</w:t>
-            </w:r>
-            <w:proofErr w:type="gramEnd"/>
-            <w:r>
-              <w:rPr>
-                <w:rFonts w:ascii="Aptos Narrow" w:hAnsi="Aptos Narrow" w:cs="Times New Roman"/>
-                <w:color w:val="000000"/>
-                <w:szCs w:val="22"/>
-                <w:lang w:val="en-SG"/>
-              </w:rPr>
-              <w:t>)</w:t>
+              <w:t>bcryptMiddleware.js (lines 3–24) – comparePassword()</w:t>
+            </w:r>
+            <w:r>
+              <w:rPr>
+                <w:rFonts w:ascii="Aptos Narrow" w:hAnsi="Aptos Narrow" w:cs="Times New Roman"/>
+                <w:color w:val="000000"/>
+                <w:szCs w:val="22"/>
+                <w:lang w:val="en-SG"/>
+              </w:rPr>
+              <w:br/>
+            </w:r>
+            <w:r>
+              <w:rPr>
+                <w:rFonts w:ascii="Aptos Narrow" w:hAnsi="Aptos Narrow" w:cs="Times New Roman"/>
+                <w:color w:val="000000"/>
+                <w:szCs w:val="22"/>
+                <w:lang w:val="en-SG"/>
+              </w:rPr>
+              <w:br/>
+              <w:t>jwtMiddleware.js (lines 3–22) – generateToken()</w:t>
             </w:r>
           </w:p>
         </w:tc>
@@ -8551,38 +9750,7 @@
                 <w:szCs w:val="22"/>
                 <w:lang w:val="en-SG"/>
               </w:rPr>
-              <w:t xml:space="preserve">AddEntityForm.js (lines 15–34) – </w:t>
-            </w:r>
-            <w:proofErr w:type="spellStart"/>
-            <w:proofErr w:type="gramStart"/>
-            <w:r>
-              <w:rPr>
-                <w:rFonts w:ascii="Aptos Narrow" w:hAnsi="Aptos Narrow" w:cs="Times New Roman"/>
-                <w:color w:val="000000"/>
-                <w:szCs w:val="22"/>
-                <w:lang w:val="en-SG"/>
-              </w:rPr>
-              <w:t>handleSubmit</w:t>
-            </w:r>
-            <w:proofErr w:type="spellEnd"/>
-            <w:r>
-              <w:rPr>
-                <w:rFonts w:ascii="Aptos Narrow" w:hAnsi="Aptos Narrow" w:cs="Times New Roman"/>
-                <w:color w:val="000000"/>
-                <w:szCs w:val="22"/>
-                <w:lang w:val="en-SG"/>
-              </w:rPr>
-              <w:t>(</w:t>
-            </w:r>
-            <w:proofErr w:type="gramEnd"/>
-            <w:r>
-              <w:rPr>
-                <w:rFonts w:ascii="Aptos Narrow" w:hAnsi="Aptos Narrow" w:cs="Times New Roman"/>
-                <w:color w:val="000000"/>
-                <w:szCs w:val="22"/>
-                <w:lang w:val="en-SG"/>
-              </w:rPr>
-              <w:t>)</w:t>
+              <w:t>AddEntityForm.js (lines 15–34) – handleSubmit()</w:t>
             </w:r>
             <w:r>
               <w:rPr>
@@ -8601,38 +9769,43 @@
                 <w:lang w:val="en-SG"/>
               </w:rPr>
               <w:br/>
-              <w:t xml:space="preserve">HomePage.js (lines 36–74) – </w:t>
-            </w:r>
-            <w:proofErr w:type="spellStart"/>
-            <w:proofErr w:type="gramStart"/>
-            <w:r>
-              <w:rPr>
-                <w:rFonts w:ascii="Aptos Narrow" w:hAnsi="Aptos Narrow" w:cs="Times New Roman"/>
-                <w:color w:val="000000"/>
-                <w:szCs w:val="22"/>
-                <w:lang w:val="en-SG"/>
-              </w:rPr>
-              <w:t>handleAdd</w:t>
-            </w:r>
-            <w:proofErr w:type="spellEnd"/>
-            <w:r>
-              <w:rPr>
-                <w:rFonts w:ascii="Aptos Narrow" w:hAnsi="Aptos Narrow" w:cs="Times New Roman"/>
-                <w:color w:val="000000"/>
-                <w:szCs w:val="22"/>
-                <w:lang w:val="en-SG"/>
-              </w:rPr>
-              <w:t>(</w:t>
-            </w:r>
-            <w:proofErr w:type="gramEnd"/>
-            <w:r>
-              <w:rPr>
-                <w:rFonts w:ascii="Aptos Narrow" w:hAnsi="Aptos Narrow" w:cs="Times New Roman"/>
-                <w:color w:val="000000"/>
-                <w:szCs w:val="22"/>
-                <w:lang w:val="en-SG"/>
-              </w:rPr>
-              <w:t>)</w:t>
+              <w:t xml:space="preserve">HomePage.js (lines </w:t>
+            </w:r>
+            <w:r>
+              <w:rPr>
+                <w:rFonts w:ascii="Aptos Narrow" w:hAnsi="Aptos Narrow" w:cs="Times New Roman"/>
+                <w:color w:val="000000"/>
+                <w:szCs w:val="22"/>
+                <w:lang w:val="en-SG"/>
+              </w:rPr>
+              <w:t>49</w:t>
+            </w:r>
+            <w:r>
+              <w:rPr>
+                <w:rFonts w:ascii="Aptos Narrow" w:hAnsi="Aptos Narrow" w:cs="Times New Roman"/>
+                <w:color w:val="000000"/>
+                <w:szCs w:val="22"/>
+                <w:lang w:val="en-SG"/>
+              </w:rPr>
+              <w:t>–</w:t>
+            </w:r>
+            <w:r>
+              <w:rPr>
+                <w:rFonts w:ascii="Aptos Narrow" w:hAnsi="Aptos Narrow" w:cs="Times New Roman"/>
+                <w:color w:val="000000"/>
+                <w:szCs w:val="22"/>
+                <w:lang w:val="en-SG"/>
+              </w:rPr>
+              <w:t>87</w:t>
+            </w:r>
+            <w:r>
+              <w:rPr>
+                <w:rFonts w:ascii="Aptos Narrow" w:hAnsi="Aptos Narrow" w:cs="Times New Roman"/>
+                <w:color w:val="000000"/>
+                <w:szCs w:val="22"/>
+                <w:lang w:val="en-SG"/>
+              </w:rPr>
+              <w:t>) – handleAdd()</w:t>
             </w:r>
             <w:r>
               <w:rPr>
@@ -8651,38 +9824,43 @@
                 <w:lang w:val="en-SG"/>
               </w:rPr>
               <w:br/>
-              <w:t xml:space="preserve">travelSlice.js (lines 69–71) – </w:t>
-            </w:r>
-            <w:proofErr w:type="spellStart"/>
-            <w:proofErr w:type="gramStart"/>
-            <w:r>
-              <w:rPr>
-                <w:rFonts w:ascii="Aptos Narrow" w:hAnsi="Aptos Narrow" w:cs="Times New Roman"/>
-                <w:color w:val="000000"/>
-                <w:szCs w:val="22"/>
-                <w:lang w:val="en-SG"/>
-              </w:rPr>
-              <w:t>addTravel</w:t>
-            </w:r>
-            <w:proofErr w:type="spellEnd"/>
-            <w:r>
-              <w:rPr>
-                <w:rFonts w:ascii="Aptos Narrow" w:hAnsi="Aptos Narrow" w:cs="Times New Roman"/>
-                <w:color w:val="000000"/>
-                <w:szCs w:val="22"/>
-                <w:lang w:val="en-SG"/>
-              </w:rPr>
-              <w:t>(</w:t>
-            </w:r>
-            <w:proofErr w:type="gramEnd"/>
-            <w:r>
-              <w:rPr>
-                <w:rFonts w:ascii="Aptos Narrow" w:hAnsi="Aptos Narrow" w:cs="Times New Roman"/>
-                <w:color w:val="000000"/>
-                <w:szCs w:val="22"/>
-                <w:lang w:val="en-SG"/>
-              </w:rPr>
-              <w:t>)</w:t>
+              <w:t xml:space="preserve">travelSlice.js (lines </w:t>
+            </w:r>
+            <w:r>
+              <w:rPr>
+                <w:rFonts w:ascii="Aptos Narrow" w:hAnsi="Aptos Narrow" w:cs="Times New Roman"/>
+                <w:color w:val="000000"/>
+                <w:szCs w:val="22"/>
+                <w:lang w:val="en-SG"/>
+              </w:rPr>
+              <w:t>13</w:t>
+            </w:r>
+            <w:r>
+              <w:rPr>
+                <w:rFonts w:ascii="Aptos Narrow" w:hAnsi="Aptos Narrow" w:cs="Times New Roman"/>
+                <w:color w:val="000000"/>
+                <w:szCs w:val="22"/>
+                <w:lang w:val="en-SG"/>
+              </w:rPr>
+              <w:t>–</w:t>
+            </w:r>
+            <w:r>
+              <w:rPr>
+                <w:rFonts w:ascii="Aptos Narrow" w:hAnsi="Aptos Narrow" w:cs="Times New Roman"/>
+                <w:color w:val="000000"/>
+                <w:szCs w:val="22"/>
+                <w:lang w:val="en-SG"/>
+              </w:rPr>
+              <w:t>15</w:t>
+            </w:r>
+            <w:r>
+              <w:rPr>
+                <w:rFonts w:ascii="Aptos Narrow" w:hAnsi="Aptos Narrow" w:cs="Times New Roman"/>
+                <w:color w:val="000000"/>
+                <w:szCs w:val="22"/>
+                <w:lang w:val="en-SG"/>
+              </w:rPr>
+              <w:t>) – addTravel()</w:t>
             </w:r>
           </w:p>
         </w:tc>
@@ -8747,38 +9925,7 @@
                 <w:szCs w:val="22"/>
                 <w:lang w:val="en-SG"/>
               </w:rPr>
-              <w:t xml:space="preserve">travelListingRoutes.js (lines 7–11) – </w:t>
-            </w:r>
-            <w:proofErr w:type="spellStart"/>
-            <w:proofErr w:type="gramStart"/>
-            <w:r>
-              <w:rPr>
-                <w:rFonts w:ascii="Aptos Narrow" w:hAnsi="Aptos Narrow" w:cs="Times New Roman"/>
-                <w:color w:val="000000"/>
-                <w:szCs w:val="22"/>
-                <w:lang w:val="en-SG"/>
-              </w:rPr>
-              <w:t>router.post</w:t>
-            </w:r>
-            <w:proofErr w:type="spellEnd"/>
-            <w:r>
-              <w:rPr>
-                <w:rFonts w:ascii="Aptos Narrow" w:hAnsi="Aptos Narrow" w:cs="Times New Roman"/>
-                <w:color w:val="000000"/>
-                <w:szCs w:val="22"/>
-                <w:lang w:val="en-SG"/>
-              </w:rPr>
-              <w:t>(</w:t>
-            </w:r>
-            <w:proofErr w:type="gramEnd"/>
-            <w:r>
-              <w:rPr>
-                <w:rFonts w:ascii="Aptos Narrow" w:hAnsi="Aptos Narrow" w:cs="Times New Roman"/>
-                <w:color w:val="000000"/>
-                <w:szCs w:val="22"/>
-                <w:lang w:val="en-SG"/>
-              </w:rPr>
-              <w:t>)</w:t>
+              <w:t>travelListingRoutes.js (lines 7–11) – router.post()</w:t>
             </w:r>
             <w:r>
               <w:rPr>
@@ -8797,38 +9944,7 @@
                 <w:lang w:val="en-SG"/>
               </w:rPr>
               <w:br/>
-              <w:t xml:space="preserve">jwtMiddleware.js (lines 24–47) – </w:t>
-            </w:r>
-            <w:proofErr w:type="spellStart"/>
-            <w:proofErr w:type="gramStart"/>
-            <w:r>
-              <w:rPr>
-                <w:rFonts w:ascii="Aptos Narrow" w:hAnsi="Aptos Narrow" w:cs="Times New Roman"/>
-                <w:color w:val="000000"/>
-                <w:szCs w:val="22"/>
-                <w:lang w:val="en-SG"/>
-              </w:rPr>
-              <w:t>verifyToken</w:t>
-            </w:r>
-            <w:proofErr w:type="spellEnd"/>
-            <w:r>
-              <w:rPr>
-                <w:rFonts w:ascii="Aptos Narrow" w:hAnsi="Aptos Narrow" w:cs="Times New Roman"/>
-                <w:color w:val="000000"/>
-                <w:szCs w:val="22"/>
-                <w:lang w:val="en-SG"/>
-              </w:rPr>
-              <w:t>(</w:t>
-            </w:r>
-            <w:proofErr w:type="gramEnd"/>
-            <w:r>
-              <w:rPr>
-                <w:rFonts w:ascii="Aptos Narrow" w:hAnsi="Aptos Narrow" w:cs="Times New Roman"/>
-                <w:color w:val="000000"/>
-                <w:szCs w:val="22"/>
-                <w:lang w:val="en-SG"/>
-              </w:rPr>
-              <w:t>)</w:t>
+              <w:t>jwtMiddleware.js (lines 24–47) – verifyToken()</w:t>
             </w:r>
             <w:r>
               <w:rPr>
@@ -8847,38 +9963,7 @@
                 <w:lang w:val="en-SG"/>
               </w:rPr>
               <w:br/>
-              <w:t xml:space="preserve">travelListingController.js (lines 3–45) – </w:t>
-            </w:r>
-            <w:proofErr w:type="spellStart"/>
-            <w:proofErr w:type="gramStart"/>
-            <w:r>
-              <w:rPr>
-                <w:rFonts w:ascii="Aptos Narrow" w:hAnsi="Aptos Narrow" w:cs="Times New Roman"/>
-                <w:color w:val="000000"/>
-                <w:szCs w:val="22"/>
-                <w:lang w:val="en-SG"/>
-              </w:rPr>
-              <w:t>createTravelListing</w:t>
-            </w:r>
-            <w:proofErr w:type="spellEnd"/>
-            <w:r>
-              <w:rPr>
-                <w:rFonts w:ascii="Aptos Narrow" w:hAnsi="Aptos Narrow" w:cs="Times New Roman"/>
-                <w:color w:val="000000"/>
-                <w:szCs w:val="22"/>
-                <w:lang w:val="en-SG"/>
-              </w:rPr>
-              <w:t>(</w:t>
-            </w:r>
-            <w:proofErr w:type="gramEnd"/>
-            <w:r>
-              <w:rPr>
-                <w:rFonts w:ascii="Aptos Narrow" w:hAnsi="Aptos Narrow" w:cs="Times New Roman"/>
-                <w:color w:val="000000"/>
-                <w:szCs w:val="22"/>
-                <w:lang w:val="en-SG"/>
-              </w:rPr>
-              <w:t>)</w:t>
+              <w:t>travelListingController.js (lines 3–45) – createTravelListing()</w:t>
             </w:r>
             <w:r>
               <w:rPr>
@@ -8897,38 +9982,7 @@
                 <w:lang w:val="en-SG"/>
               </w:rPr>
               <w:br/>
-              <w:t xml:space="preserve">travelListingModel.js (lines 3–20) – </w:t>
-            </w:r>
-            <w:proofErr w:type="spellStart"/>
-            <w:proofErr w:type="gramStart"/>
-            <w:r>
-              <w:rPr>
-                <w:rFonts w:ascii="Aptos Narrow" w:hAnsi="Aptos Narrow" w:cs="Times New Roman"/>
-                <w:color w:val="000000"/>
-                <w:szCs w:val="22"/>
-                <w:lang w:val="en-SG"/>
-              </w:rPr>
-              <w:t>insertSingle</w:t>
-            </w:r>
-            <w:proofErr w:type="spellEnd"/>
-            <w:r>
-              <w:rPr>
-                <w:rFonts w:ascii="Aptos Narrow" w:hAnsi="Aptos Narrow" w:cs="Times New Roman"/>
-                <w:color w:val="000000"/>
-                <w:szCs w:val="22"/>
-                <w:lang w:val="en-SG"/>
-              </w:rPr>
-              <w:t>(</w:t>
-            </w:r>
-            <w:proofErr w:type="gramEnd"/>
-            <w:r>
-              <w:rPr>
-                <w:rFonts w:ascii="Aptos Narrow" w:hAnsi="Aptos Narrow" w:cs="Times New Roman"/>
-                <w:color w:val="000000"/>
-                <w:szCs w:val="22"/>
-                <w:lang w:val="en-SG"/>
-              </w:rPr>
-              <w:t>)</w:t>
+              <w:t>travelListingModel.js (lines 3–20) – insertSingle()</w:t>
             </w:r>
           </w:p>
         </w:tc>
@@ -8997,38 +10051,7 @@
                 <w:szCs w:val="22"/>
                 <w:lang w:val="en-SG"/>
               </w:rPr>
-              <w:t xml:space="preserve">EditTravelForm.js (lines 17–29) – </w:t>
-            </w:r>
-            <w:proofErr w:type="spellStart"/>
-            <w:proofErr w:type="gramStart"/>
-            <w:r>
-              <w:rPr>
-                <w:rFonts w:ascii="Aptos Narrow" w:hAnsi="Aptos Narrow" w:cs="Times New Roman"/>
-                <w:color w:val="000000"/>
-                <w:szCs w:val="22"/>
-                <w:lang w:val="en-SG"/>
-              </w:rPr>
-              <w:t>handleSubmit</w:t>
-            </w:r>
-            <w:proofErr w:type="spellEnd"/>
-            <w:r>
-              <w:rPr>
-                <w:rFonts w:ascii="Aptos Narrow" w:hAnsi="Aptos Narrow" w:cs="Times New Roman"/>
-                <w:color w:val="000000"/>
-                <w:szCs w:val="22"/>
-                <w:lang w:val="en-SG"/>
-              </w:rPr>
-              <w:t>(</w:t>
-            </w:r>
-            <w:proofErr w:type="gramEnd"/>
-            <w:r>
-              <w:rPr>
-                <w:rFonts w:ascii="Aptos Narrow" w:hAnsi="Aptos Narrow" w:cs="Times New Roman"/>
-                <w:color w:val="000000"/>
-                <w:szCs w:val="22"/>
-                <w:lang w:val="en-SG"/>
-              </w:rPr>
-              <w:t>)</w:t>
+              <w:t>EditTravelForm.js (lines 17–29) – handleSubmit()</w:t>
             </w:r>
             <w:r>
               <w:rPr>
@@ -9047,69 +10070,43 @@
                 <w:lang w:val="en-SG"/>
               </w:rPr>
               <w:br/>
-              <w:t xml:space="preserve">HomePage.js (lines 82–119) – </w:t>
-            </w:r>
-            <w:proofErr w:type="spellStart"/>
-            <w:proofErr w:type="gramStart"/>
-            <w:r>
-              <w:rPr>
-                <w:rFonts w:ascii="Aptos Narrow" w:hAnsi="Aptos Narrow" w:cs="Times New Roman"/>
-                <w:color w:val="000000"/>
-                <w:szCs w:val="22"/>
-                <w:lang w:val="en-SG"/>
-              </w:rPr>
-              <w:t>handleEdit</w:t>
-            </w:r>
-            <w:proofErr w:type="spellEnd"/>
-            <w:r>
-              <w:rPr>
-                <w:rFonts w:ascii="Aptos Narrow" w:hAnsi="Aptos Narrow" w:cs="Times New Roman"/>
-                <w:color w:val="000000"/>
-                <w:szCs w:val="22"/>
-                <w:lang w:val="en-SG"/>
-              </w:rPr>
-              <w:t>(</w:t>
-            </w:r>
-            <w:proofErr w:type="gramEnd"/>
-            <w:r>
-              <w:rPr>
-                <w:rFonts w:ascii="Aptos Narrow" w:hAnsi="Aptos Narrow" w:cs="Times New Roman"/>
-                <w:color w:val="000000"/>
-                <w:szCs w:val="22"/>
-                <w:lang w:val="en-SG"/>
-              </w:rPr>
-              <w:t xml:space="preserve">), </w:t>
-            </w:r>
-            <w:proofErr w:type="spellStart"/>
-            <w:proofErr w:type="gramStart"/>
-            <w:r>
-              <w:rPr>
-                <w:rFonts w:ascii="Aptos Narrow" w:hAnsi="Aptos Narrow" w:cs="Times New Roman"/>
-                <w:color w:val="000000"/>
-                <w:szCs w:val="22"/>
-                <w:lang w:val="en-SG"/>
-              </w:rPr>
-              <w:t>handleSaveEdit</w:t>
-            </w:r>
-            <w:proofErr w:type="spellEnd"/>
-            <w:r>
-              <w:rPr>
-                <w:rFonts w:ascii="Aptos Narrow" w:hAnsi="Aptos Narrow" w:cs="Times New Roman"/>
-                <w:color w:val="000000"/>
-                <w:szCs w:val="22"/>
-                <w:lang w:val="en-SG"/>
-              </w:rPr>
-              <w:t>(</w:t>
-            </w:r>
-            <w:proofErr w:type="gramEnd"/>
-            <w:r>
-              <w:rPr>
-                <w:rFonts w:ascii="Aptos Narrow" w:hAnsi="Aptos Narrow" w:cs="Times New Roman"/>
-                <w:color w:val="000000"/>
-                <w:szCs w:val="22"/>
-                <w:lang w:val="en-SG"/>
-              </w:rPr>
-              <w:t>)</w:t>
+              <w:t xml:space="preserve">HomePage.js (lines </w:t>
+            </w:r>
+            <w:r>
+              <w:rPr>
+                <w:rFonts w:ascii="Aptos Narrow" w:hAnsi="Aptos Narrow" w:cs="Times New Roman"/>
+                <w:color w:val="000000"/>
+                <w:szCs w:val="22"/>
+                <w:lang w:val="en-SG"/>
+              </w:rPr>
+              <w:t>95</w:t>
+            </w:r>
+            <w:r>
+              <w:rPr>
+                <w:rFonts w:ascii="Aptos Narrow" w:hAnsi="Aptos Narrow" w:cs="Times New Roman"/>
+                <w:color w:val="000000"/>
+                <w:szCs w:val="22"/>
+                <w:lang w:val="en-SG"/>
+              </w:rPr>
+              <w:t>–1</w:t>
+            </w:r>
+            <w:r>
+              <w:rPr>
+                <w:rFonts w:ascii="Aptos Narrow" w:hAnsi="Aptos Narrow" w:cs="Times New Roman"/>
+                <w:color w:val="000000"/>
+                <w:szCs w:val="22"/>
+                <w:lang w:val="en-SG"/>
+              </w:rPr>
+              <w:t>32</w:t>
+            </w:r>
+            <w:r>
+              <w:rPr>
+                <w:rFonts w:ascii="Aptos Narrow" w:hAnsi="Aptos Narrow" w:cs="Times New Roman"/>
+                <w:color w:val="000000"/>
+                <w:szCs w:val="22"/>
+                <w:lang w:val="en-SG"/>
+              </w:rPr>
+              <w:t>) – handleEdit(), handleSaveEdit()</w:t>
             </w:r>
             <w:r>
               <w:rPr>
@@ -9128,38 +10125,43 @@
                 <w:lang w:val="en-SG"/>
               </w:rPr>
               <w:br/>
-              <w:t xml:space="preserve">travelSlice.js (lines 109–117) – </w:t>
-            </w:r>
-            <w:proofErr w:type="spellStart"/>
-            <w:proofErr w:type="gramStart"/>
-            <w:r>
-              <w:rPr>
-                <w:rFonts w:ascii="Aptos Narrow" w:hAnsi="Aptos Narrow" w:cs="Times New Roman"/>
-                <w:color w:val="000000"/>
-                <w:szCs w:val="22"/>
-                <w:lang w:val="en-SG"/>
-              </w:rPr>
-              <w:t>updateTravel</w:t>
-            </w:r>
-            <w:proofErr w:type="spellEnd"/>
-            <w:r>
-              <w:rPr>
-                <w:rFonts w:ascii="Aptos Narrow" w:hAnsi="Aptos Narrow" w:cs="Times New Roman"/>
-                <w:color w:val="000000"/>
-                <w:szCs w:val="22"/>
-                <w:lang w:val="en-SG"/>
-              </w:rPr>
-              <w:t>(</w:t>
-            </w:r>
-            <w:proofErr w:type="gramEnd"/>
-            <w:r>
-              <w:rPr>
-                <w:rFonts w:ascii="Aptos Narrow" w:hAnsi="Aptos Narrow" w:cs="Times New Roman"/>
-                <w:color w:val="000000"/>
-                <w:szCs w:val="22"/>
-                <w:lang w:val="en-SG"/>
-              </w:rPr>
-              <w:t>)</w:t>
+              <w:t xml:space="preserve">travelSlice.js (lines </w:t>
+            </w:r>
+            <w:r>
+              <w:rPr>
+                <w:rFonts w:ascii="Aptos Narrow" w:hAnsi="Aptos Narrow" w:cs="Times New Roman"/>
+                <w:color w:val="000000"/>
+                <w:szCs w:val="22"/>
+                <w:lang w:val="en-SG"/>
+              </w:rPr>
+              <w:t>53</w:t>
+            </w:r>
+            <w:r>
+              <w:rPr>
+                <w:rFonts w:ascii="Aptos Narrow" w:hAnsi="Aptos Narrow" w:cs="Times New Roman"/>
+                <w:color w:val="000000"/>
+                <w:szCs w:val="22"/>
+                <w:lang w:val="en-SG"/>
+              </w:rPr>
+              <w:t>–</w:t>
+            </w:r>
+            <w:r>
+              <w:rPr>
+                <w:rFonts w:ascii="Aptos Narrow" w:hAnsi="Aptos Narrow" w:cs="Times New Roman"/>
+                <w:color w:val="000000"/>
+                <w:szCs w:val="22"/>
+                <w:lang w:val="en-SG"/>
+              </w:rPr>
+              <w:t>61</w:t>
+            </w:r>
+            <w:r>
+              <w:rPr>
+                <w:rFonts w:ascii="Aptos Narrow" w:hAnsi="Aptos Narrow" w:cs="Times New Roman"/>
+                <w:color w:val="000000"/>
+                <w:szCs w:val="22"/>
+                <w:lang w:val="en-SG"/>
+              </w:rPr>
+              <w:t>) – updateTravel()</w:t>
             </w:r>
           </w:p>
         </w:tc>
@@ -9224,38 +10226,7 @@
                 <w:szCs w:val="22"/>
                 <w:lang w:val="en-SG"/>
               </w:rPr>
-              <w:t xml:space="preserve">travelListingRoutes.js (lines 13–17) – </w:t>
-            </w:r>
-            <w:proofErr w:type="spellStart"/>
-            <w:proofErr w:type="gramStart"/>
-            <w:r>
-              <w:rPr>
-                <w:rFonts w:ascii="Aptos Narrow" w:hAnsi="Aptos Narrow" w:cs="Times New Roman"/>
-                <w:color w:val="000000"/>
-                <w:szCs w:val="22"/>
-                <w:lang w:val="en-SG"/>
-              </w:rPr>
-              <w:t>router.put</w:t>
-            </w:r>
-            <w:proofErr w:type="spellEnd"/>
-            <w:r>
-              <w:rPr>
-                <w:rFonts w:ascii="Aptos Narrow" w:hAnsi="Aptos Narrow" w:cs="Times New Roman"/>
-                <w:color w:val="000000"/>
-                <w:szCs w:val="22"/>
-                <w:lang w:val="en-SG"/>
-              </w:rPr>
-              <w:t>(</w:t>
-            </w:r>
-            <w:proofErr w:type="gramEnd"/>
-            <w:r>
-              <w:rPr>
-                <w:rFonts w:ascii="Aptos Narrow" w:hAnsi="Aptos Narrow" w:cs="Times New Roman"/>
-                <w:color w:val="000000"/>
-                <w:szCs w:val="22"/>
-                <w:lang w:val="en-SG"/>
-              </w:rPr>
-              <w:t>)</w:t>
+              <w:t>travelListingRoutes.js (lines 13–17) – router.put()</w:t>
             </w:r>
             <w:r>
               <w:rPr>
@@ -9274,38 +10245,7 @@
                 <w:lang w:val="en-SG"/>
               </w:rPr>
               <w:br/>
-              <w:t xml:space="preserve">jwtMiddleware.js (lines 24–47) – </w:t>
-            </w:r>
-            <w:proofErr w:type="spellStart"/>
-            <w:proofErr w:type="gramStart"/>
-            <w:r>
-              <w:rPr>
-                <w:rFonts w:ascii="Aptos Narrow" w:hAnsi="Aptos Narrow" w:cs="Times New Roman"/>
-                <w:color w:val="000000"/>
-                <w:szCs w:val="22"/>
-                <w:lang w:val="en-SG"/>
-              </w:rPr>
-              <w:t>verifyToken</w:t>
-            </w:r>
-            <w:proofErr w:type="spellEnd"/>
-            <w:r>
-              <w:rPr>
-                <w:rFonts w:ascii="Aptos Narrow" w:hAnsi="Aptos Narrow" w:cs="Times New Roman"/>
-                <w:color w:val="000000"/>
-                <w:szCs w:val="22"/>
-                <w:lang w:val="en-SG"/>
-              </w:rPr>
-              <w:t>(</w:t>
-            </w:r>
-            <w:proofErr w:type="gramEnd"/>
-            <w:r>
-              <w:rPr>
-                <w:rFonts w:ascii="Aptos Narrow" w:hAnsi="Aptos Narrow" w:cs="Times New Roman"/>
-                <w:color w:val="000000"/>
-                <w:szCs w:val="22"/>
-                <w:lang w:val="en-SG"/>
-              </w:rPr>
-              <w:t>)</w:t>
+              <w:t>jwtMiddleware.js (lines 24–47) – verifyToken()</w:t>
             </w:r>
             <w:r>
               <w:rPr>
@@ -9324,38 +10264,7 @@
                 <w:lang w:val="en-SG"/>
               </w:rPr>
               <w:br/>
-              <w:t xml:space="preserve">travelListingController.js (lines 75–124) – </w:t>
-            </w:r>
-            <w:proofErr w:type="spellStart"/>
-            <w:proofErr w:type="gramStart"/>
-            <w:r>
-              <w:rPr>
-                <w:rFonts w:ascii="Aptos Narrow" w:hAnsi="Aptos Narrow" w:cs="Times New Roman"/>
-                <w:color w:val="000000"/>
-                <w:szCs w:val="22"/>
-                <w:lang w:val="en-SG"/>
-              </w:rPr>
-              <w:t>updateTravelListing</w:t>
-            </w:r>
-            <w:proofErr w:type="spellEnd"/>
-            <w:r>
-              <w:rPr>
-                <w:rFonts w:ascii="Aptos Narrow" w:hAnsi="Aptos Narrow" w:cs="Times New Roman"/>
-                <w:color w:val="000000"/>
-                <w:szCs w:val="22"/>
-                <w:lang w:val="en-SG"/>
-              </w:rPr>
-              <w:t>(</w:t>
-            </w:r>
-            <w:proofErr w:type="gramEnd"/>
-            <w:r>
-              <w:rPr>
-                <w:rFonts w:ascii="Aptos Narrow" w:hAnsi="Aptos Narrow" w:cs="Times New Roman"/>
-                <w:color w:val="000000"/>
-                <w:szCs w:val="22"/>
-                <w:lang w:val="en-SG"/>
-              </w:rPr>
-              <w:t>)</w:t>
+              <w:t>travelListingController.js (lines 75–124) – updateTravelListing()</w:t>
             </w:r>
             <w:r>
               <w:rPr>
@@ -9374,38 +10283,7 @@
                 <w:lang w:val="en-SG"/>
               </w:rPr>
               <w:br/>
-              <w:t xml:space="preserve">travelListingModel.js (lines 44–68) – </w:t>
-            </w:r>
-            <w:proofErr w:type="spellStart"/>
-            <w:proofErr w:type="gramStart"/>
-            <w:r>
-              <w:rPr>
-                <w:rFonts w:ascii="Aptos Narrow" w:hAnsi="Aptos Narrow" w:cs="Times New Roman"/>
-                <w:color w:val="000000"/>
-                <w:szCs w:val="22"/>
-                <w:lang w:val="en-SG"/>
-              </w:rPr>
-              <w:t>updateById</w:t>
-            </w:r>
-            <w:proofErr w:type="spellEnd"/>
-            <w:r>
-              <w:rPr>
-                <w:rFonts w:ascii="Aptos Narrow" w:hAnsi="Aptos Narrow" w:cs="Times New Roman"/>
-                <w:color w:val="000000"/>
-                <w:szCs w:val="22"/>
-                <w:lang w:val="en-SG"/>
-              </w:rPr>
-              <w:t>(</w:t>
-            </w:r>
-            <w:proofErr w:type="gramEnd"/>
-            <w:r>
-              <w:rPr>
-                <w:rFonts w:ascii="Aptos Narrow" w:hAnsi="Aptos Narrow" w:cs="Times New Roman"/>
-                <w:color w:val="000000"/>
-                <w:szCs w:val="22"/>
-                <w:lang w:val="en-SG"/>
-              </w:rPr>
-              <w:t>)</w:t>
+              <w:t>travelListingModel.js (lines 44–68) – updateById()</w:t>
             </w:r>
           </w:p>
         </w:tc>
@@ -9418,25 +10296,426 @@
         </w:rPr>
       </w:pPr>
     </w:p>
-    <w:p/>
-    <w:p/>
+    <w:p>
+      <w:pPr>
+        <w:rPr>
+          <w:lang w:val="en-SG"/>
+        </w:rPr>
+      </w:pPr>
+    </w:p>
+    <w:p>
+      <w:pPr>
+        <w:rPr>
+          <w:lang w:val="en-SG"/>
+        </w:rPr>
+      </w:pPr>
+    </w:p>
+    <w:p>
+      <w:pPr>
+        <w:rPr>
+          <w:lang w:val="en-SG"/>
+        </w:rPr>
+      </w:pPr>
+    </w:p>
+    <w:tbl>
+      <w:tblPr>
+        <w:tblW w:w="9067" w:type="dxa"/>
+        <w:tblLook w:val="04A0" w:firstRow="1" w:lastRow="0" w:firstColumn="1" w:lastColumn="0" w:noHBand="0" w:noVBand="1"/>
+      </w:tblPr>
+      <w:tblGrid>
+        <w:gridCol w:w="1696"/>
+        <w:gridCol w:w="2626"/>
+        <w:gridCol w:w="921"/>
+        <w:gridCol w:w="3824"/>
+      </w:tblGrid>
+      <w:tr>
+        <w:trPr>
+          <w:trHeight w:val="900"/>
+        </w:trPr>
+        <w:tc>
+          <w:tcPr>
+            <w:tcW w:w="1696" w:type="dxa"/>
+            <w:tcBorders>
+              <w:top w:val="single" w:sz="4" w:space="0" w:color="auto"/>
+              <w:left w:val="single" w:sz="4" w:space="0" w:color="auto"/>
+              <w:bottom w:val="single" w:sz="4" w:space="0" w:color="auto"/>
+              <w:right w:val="single" w:sz="4" w:space="0" w:color="auto"/>
+            </w:tcBorders>
+            <w:vAlign w:val="center"/>
+            <w:hideMark/>
+          </w:tcPr>
+          <w:p>
+            <w:pPr>
+              <w:jc w:val="center"/>
+              <w:rPr>
+                <w:rFonts w:ascii="Aptos Narrow" w:hAnsi="Aptos Narrow" w:cs="Times New Roman"/>
+                <w:b/>
+                <w:bCs/>
+                <w:color w:val="000000"/>
+                <w:szCs w:val="22"/>
+                <w:lang w:val="en-SG"/>
+              </w:rPr>
+            </w:pPr>
+            <w:r>
+              <w:rPr>
+                <w:rFonts w:ascii="Aptos Narrow" w:hAnsi="Aptos Narrow" w:cs="Times New Roman"/>
+                <w:b/>
+                <w:bCs/>
+                <w:color w:val="000000"/>
+                <w:szCs w:val="22"/>
+                <w:lang w:val="en-SG"/>
+              </w:rPr>
+              <w:lastRenderedPageBreak/>
+              <w:t>Function Integrated</w:t>
+            </w:r>
+          </w:p>
+        </w:tc>
+        <w:tc>
+          <w:tcPr>
+            <w:tcW w:w="2626" w:type="dxa"/>
+            <w:tcBorders>
+              <w:top w:val="single" w:sz="4" w:space="0" w:color="auto"/>
+              <w:left w:val="nil"/>
+              <w:bottom w:val="single" w:sz="4" w:space="0" w:color="auto"/>
+              <w:right w:val="single" w:sz="4" w:space="0" w:color="auto"/>
+            </w:tcBorders>
+            <w:vAlign w:val="center"/>
+            <w:hideMark/>
+          </w:tcPr>
+          <w:p>
+            <w:pPr>
+              <w:jc w:val="center"/>
+              <w:rPr>
+                <w:rFonts w:ascii="Aptos Narrow" w:hAnsi="Aptos Narrow" w:cs="Times New Roman"/>
+                <w:b/>
+                <w:bCs/>
+                <w:color w:val="000000"/>
+                <w:szCs w:val="22"/>
+                <w:lang w:val="en-SG"/>
+              </w:rPr>
+            </w:pPr>
+            <w:r>
+              <w:rPr>
+                <w:rFonts w:ascii="Aptos Narrow" w:hAnsi="Aptos Narrow" w:cs="Times New Roman"/>
+                <w:b/>
+                <w:bCs/>
+                <w:color w:val="000000"/>
+                <w:szCs w:val="22"/>
+                <w:lang w:val="en-SG"/>
+              </w:rPr>
+              <w:t>Details of Front End Codes</w:t>
+            </w:r>
+          </w:p>
+        </w:tc>
+        <w:tc>
+          <w:tcPr>
+            <w:tcW w:w="921" w:type="dxa"/>
+            <w:tcBorders>
+              <w:top w:val="single" w:sz="4" w:space="0" w:color="auto"/>
+              <w:left w:val="nil"/>
+              <w:bottom w:val="single" w:sz="4" w:space="0" w:color="auto"/>
+              <w:right w:val="single" w:sz="4" w:space="0" w:color="auto"/>
+            </w:tcBorders>
+            <w:vAlign w:val="center"/>
+            <w:hideMark/>
+          </w:tcPr>
+          <w:p>
+            <w:pPr>
+              <w:jc w:val="center"/>
+              <w:rPr>
+                <w:rFonts w:ascii="Aptos Narrow" w:hAnsi="Aptos Narrow" w:cs="Times New Roman"/>
+                <w:b/>
+                <w:bCs/>
+                <w:color w:val="000000"/>
+                <w:szCs w:val="22"/>
+                <w:lang w:val="en-SG"/>
+              </w:rPr>
+            </w:pPr>
+            <w:r>
+              <w:rPr>
+                <w:rFonts w:ascii="Aptos Narrow" w:hAnsi="Aptos Narrow" w:cs="Times New Roman"/>
+                <w:b/>
+                <w:bCs/>
+                <w:color w:val="000000"/>
+                <w:szCs w:val="22"/>
+                <w:lang w:val="en-SG"/>
+              </w:rPr>
+              <w:t>&lt;&gt;</w:t>
+            </w:r>
+          </w:p>
+        </w:tc>
+        <w:tc>
+          <w:tcPr>
+            <w:tcW w:w="3824" w:type="dxa"/>
+            <w:tcBorders>
+              <w:top w:val="single" w:sz="4" w:space="0" w:color="auto"/>
+              <w:left w:val="nil"/>
+              <w:bottom w:val="single" w:sz="4" w:space="0" w:color="auto"/>
+              <w:right w:val="single" w:sz="4" w:space="0" w:color="auto"/>
+            </w:tcBorders>
+            <w:vAlign w:val="center"/>
+            <w:hideMark/>
+          </w:tcPr>
+          <w:p>
+            <w:pPr>
+              <w:jc w:val="center"/>
+              <w:rPr>
+                <w:rFonts w:ascii="Aptos Narrow" w:hAnsi="Aptos Narrow" w:cs="Times New Roman"/>
+                <w:b/>
+                <w:bCs/>
+                <w:color w:val="000000"/>
+                <w:szCs w:val="22"/>
+                <w:lang w:val="en-SG"/>
+              </w:rPr>
+            </w:pPr>
+            <w:r>
+              <w:rPr>
+                <w:rFonts w:ascii="Aptos Narrow" w:hAnsi="Aptos Narrow" w:cs="Times New Roman"/>
+                <w:b/>
+                <w:bCs/>
+                <w:color w:val="000000"/>
+                <w:szCs w:val="22"/>
+                <w:lang w:val="en-SG"/>
+              </w:rPr>
+              <w:t>Details of Back End Codes</w:t>
+            </w:r>
+          </w:p>
+        </w:tc>
+      </w:tr>
+      <w:tr>
+        <w:trPr>
+          <w:trHeight w:val="2580"/>
+        </w:trPr>
+        <w:tc>
+          <w:tcPr>
+            <w:tcW w:w="1696" w:type="dxa"/>
+            <w:tcBorders>
+              <w:top w:val="nil"/>
+              <w:left w:val="single" w:sz="4" w:space="0" w:color="auto"/>
+              <w:bottom w:val="single" w:sz="4" w:space="0" w:color="auto"/>
+              <w:right w:val="single" w:sz="4" w:space="0" w:color="auto"/>
+            </w:tcBorders>
+            <w:vAlign w:val="center"/>
+            <w:hideMark/>
+          </w:tcPr>
+          <w:p>
+            <w:pPr>
+              <w:rPr>
+                <w:rFonts w:ascii="Aptos Narrow" w:hAnsi="Aptos Narrow" w:cs="Times New Roman"/>
+                <w:color w:val="000000"/>
+                <w:szCs w:val="22"/>
+                <w:lang w:val="en-SG"/>
+              </w:rPr>
+            </w:pPr>
+            <w:r>
+              <w:rPr>
+                <w:rFonts w:ascii="Aptos Narrow" w:hAnsi="Aptos Narrow" w:cs="Times New Roman"/>
+                <w:color w:val="000000"/>
+                <w:szCs w:val="22"/>
+                <w:lang w:val="en-SG"/>
+              </w:rPr>
+              <w:t>List Travel</w:t>
+            </w:r>
+          </w:p>
+        </w:tc>
+        <w:tc>
+          <w:tcPr>
+            <w:tcW w:w="2626" w:type="dxa"/>
+            <w:tcBorders>
+              <w:top w:val="nil"/>
+              <w:left w:val="nil"/>
+              <w:bottom w:val="single" w:sz="4" w:space="0" w:color="auto"/>
+              <w:right w:val="single" w:sz="4" w:space="0" w:color="auto"/>
+            </w:tcBorders>
+            <w:vAlign w:val="center"/>
+            <w:hideMark/>
+          </w:tcPr>
+          <w:p>
+            <w:pPr>
+              <w:rPr>
+                <w:rFonts w:ascii="Aptos Narrow" w:hAnsi="Aptos Narrow" w:cs="Times New Roman"/>
+                <w:color w:val="000000"/>
+                <w:szCs w:val="22"/>
+                <w:lang w:val="en-SG"/>
+              </w:rPr>
+            </w:pPr>
+            <w:r>
+              <w:rPr>
+                <w:rFonts w:ascii="Aptos Narrow" w:hAnsi="Aptos Narrow" w:cs="Times New Roman"/>
+                <w:color w:val="000000"/>
+                <w:szCs w:val="22"/>
+                <w:lang w:val="en-SG"/>
+              </w:rPr>
+              <w:t>HomePage.js (lines 22–33) – useEffect(),</w:t>
+            </w:r>
+            <w:r>
+              <w:rPr>
+                <w:rFonts w:ascii="Aptos Narrow" w:hAnsi="Aptos Narrow" w:cs="Times New Roman"/>
+                <w:color w:val="000000"/>
+                <w:szCs w:val="22"/>
+                <w:lang w:val="en-SG"/>
+              </w:rPr>
+              <w:t xml:space="preserve"> </w:t>
+            </w:r>
+            <w:r>
+              <w:rPr>
+                <w:rFonts w:ascii="Aptos Narrow" w:hAnsi="Aptos Narrow" w:cs="Times New Roman"/>
+                <w:color w:val="000000"/>
+                <w:szCs w:val="22"/>
+                <w:lang w:val="en-SG"/>
+              </w:rPr>
+              <w:t>loadTravels()</w:t>
+            </w:r>
+          </w:p>
+          <w:p>
+            <w:pPr>
+              <w:rPr>
+                <w:rFonts w:ascii="Aptos Narrow" w:hAnsi="Aptos Narrow" w:cs="Times New Roman"/>
+                <w:color w:val="000000"/>
+                <w:szCs w:val="22"/>
+                <w:lang w:val="en-SG"/>
+              </w:rPr>
+            </w:pPr>
+          </w:p>
+          <w:p>
+            <w:pPr>
+              <w:rPr>
+                <w:rFonts w:ascii="Aptos Narrow" w:hAnsi="Aptos Narrow" w:cs="Times New Roman"/>
+                <w:color w:val="000000"/>
+                <w:szCs w:val="22"/>
+                <w:lang w:val="en-SG"/>
+              </w:rPr>
+            </w:pPr>
+            <w:r>
+              <w:rPr>
+                <w:rFonts w:ascii="Aptos Narrow" w:hAnsi="Aptos Narrow" w:cs="Times New Roman"/>
+                <w:color w:val="000000"/>
+                <w:szCs w:val="22"/>
+                <w:lang w:val="en-SG"/>
+              </w:rPr>
+              <w:t>travelSlice.js (lines 63–65) – setTravels()</w:t>
+            </w:r>
+          </w:p>
+        </w:tc>
+        <w:tc>
+          <w:tcPr>
+            <w:tcW w:w="921" w:type="dxa"/>
+            <w:tcBorders>
+              <w:top w:val="nil"/>
+              <w:left w:val="nil"/>
+              <w:bottom w:val="single" w:sz="4" w:space="0" w:color="auto"/>
+              <w:right w:val="single" w:sz="4" w:space="0" w:color="auto"/>
+            </w:tcBorders>
+            <w:vAlign w:val="center"/>
+            <w:hideMark/>
+          </w:tcPr>
+          <w:p>
+            <w:pPr>
+              <w:jc w:val="center"/>
+              <w:rPr>
+                <w:rFonts w:ascii="Aptos Narrow" w:hAnsi="Aptos Narrow" w:cs="Times New Roman"/>
+                <w:color w:val="000000"/>
+                <w:szCs w:val="22"/>
+                <w:lang w:val="en-SG"/>
+              </w:rPr>
+            </w:pPr>
+            <w:r>
+              <w:rPr>
+                <w:rFonts w:ascii="Aptos Narrow" w:hAnsi="Aptos Narrow" w:cs="Times New Roman"/>
+                <w:color w:val="000000"/>
+                <w:szCs w:val="22"/>
+                <w:lang w:val="en-SG"/>
+              </w:rPr>
+              <w:t>&lt;&gt;</w:t>
+            </w:r>
+          </w:p>
+        </w:tc>
+        <w:tc>
+          <w:tcPr>
+            <w:tcW w:w="3824" w:type="dxa"/>
+            <w:tcBorders>
+              <w:top w:val="nil"/>
+              <w:left w:val="nil"/>
+              <w:bottom w:val="single" w:sz="4" w:space="0" w:color="auto"/>
+              <w:right w:val="single" w:sz="4" w:space="0" w:color="auto"/>
+            </w:tcBorders>
+            <w:vAlign w:val="center"/>
+            <w:hideMark/>
+          </w:tcPr>
+          <w:p>
+            <w:pPr>
+              <w:rPr>
+                <w:rFonts w:ascii="Aptos Narrow" w:hAnsi="Aptos Narrow" w:cs="Times New Roman"/>
+                <w:color w:val="000000"/>
+                <w:szCs w:val="22"/>
+                <w:lang w:val="en-SG"/>
+              </w:rPr>
+            </w:pPr>
+            <w:r>
+              <w:rPr>
+                <w:rFonts w:ascii="Aptos Narrow" w:hAnsi="Aptos Narrow" w:cs="Times New Roman"/>
+                <w:color w:val="000000"/>
+                <w:szCs w:val="22"/>
+                <w:lang w:val="en-SG"/>
+              </w:rPr>
+              <w:t>travelListingRoutes.js (line 25) – router.get()</w:t>
+            </w:r>
+            <w:r>
+              <w:rPr>
+                <w:rFonts w:ascii="Aptos Narrow" w:hAnsi="Aptos Narrow" w:cs="Times New Roman"/>
+                <w:color w:val="000000"/>
+                <w:szCs w:val="22"/>
+                <w:lang w:val="en-SG"/>
+              </w:rPr>
+              <w:br/>
+            </w:r>
+            <w:r>
+              <w:rPr>
+                <w:rFonts w:ascii="Aptos Narrow" w:hAnsi="Aptos Narrow" w:cs="Times New Roman"/>
+                <w:color w:val="000000"/>
+                <w:szCs w:val="22"/>
+                <w:lang w:val="en-SG"/>
+              </w:rPr>
+              <w:br/>
+              <w:t>travelListingController.js (lines 47–55) – getAllTravelListings()</w:t>
+            </w:r>
+            <w:r>
+              <w:rPr>
+                <w:rFonts w:ascii="Aptos Narrow" w:hAnsi="Aptos Narrow" w:cs="Times New Roman"/>
+                <w:color w:val="000000"/>
+                <w:szCs w:val="22"/>
+                <w:lang w:val="en-SG"/>
+              </w:rPr>
+              <w:br/>
+            </w:r>
+            <w:r>
+              <w:rPr>
+                <w:rFonts w:ascii="Aptos Narrow" w:hAnsi="Aptos Narrow" w:cs="Times New Roman"/>
+                <w:color w:val="000000"/>
+                <w:szCs w:val="22"/>
+                <w:lang w:val="en-SG"/>
+              </w:rPr>
+              <w:br/>
+              <w:t>travelListingModel.js (lines 22–29) – selectAll()</w:t>
+            </w:r>
+          </w:p>
+        </w:tc>
+      </w:tr>
+    </w:tbl>
     <w:p>
       <w:pPr>
         <w:pStyle w:val="Heading1"/>
-        <w:ind w:left="0" w:firstLine="0"/>
+        <w:numPr>
+          <w:ilvl w:val="0"/>
+          <w:numId w:val="0"/>
+        </w:numPr>
       </w:pPr>
       <w:bookmarkStart w:id="8" w:name="_heading=h.4d34og8" w:colFirst="0" w:colLast="0"/>
       <w:bookmarkEnd w:id="8"/>
-      <w:r>
-        <w:rPr>
-          <w:i/>
-        </w:rPr>
-        <w:t xml:space="preserve"> </w:t>
-      </w:r>
     </w:p>
     <w:sectPr>
-      <w:headerReference w:type="default" r:id="rId29"/>
-      <w:footerReference w:type="default" r:id="rId30"/>
+      <w:headerReference w:type="default" r:id="rId33"/>
+      <w:footerReference w:type="default" r:id="rId34"/>
       <w:pgSz w:w="11906" w:h="16838"/>
       <w:pgMar w:top="1134" w:right="1418" w:bottom="1134" w:left="1418" w:header="709" w:footer="709" w:gutter="0"/>
       <w:cols w:space="720"/>
@@ -10942,6 +12221,7 @@
   <w:style w:type="character" w:default="1" w:styleId="DefaultParagraphFont">
     <w:name w:val="Default Paragraph Font"/>
     <w:uiPriority w:val="1"/>
+    <w:semiHidden/>
     <w:unhideWhenUsed/>
   </w:style>
   <w:style w:type="table" w:default="1" w:styleId="TableNormal">
@@ -12466,27 +13746,6 @@
 </file>
 
 <file path=customXml/item1.xml><?xml version="1.0" encoding="utf-8"?>
-<go:gDocsCustomXmlDataStorage xmlns:go="http://customooxmlschemas.google.com/" xmlns:r="http://schemas.openxmlformats.org/officeDocument/2006/relationships" uri="GoogleDocsCustomDataVersion1">
-  <go:docsCustomData xmlns:go="http://customooxmlschemas.google.com/" roundtripDataSignature="AMtx7mies+KBQbqO1iLlLUC8NQ1ta8vRTQ==">AMUW2mVs91az8wa1tjm0QuJxat9wiYJvCE5l2c3ZtOgRcqmj6KNfXwWnccCntETrU90rhxEpw4L3w6Zii+U5aW44abjebAqjlcyJmWwABHJKFIWZadReDhDtwf7BJ4rJ/UUWC5qmDni84eztB5aXZWckKJ34i/sTJuk8I4m+pB6KQ+wP5O1MafGlLD3SKH8h3c25oMDKqWYme+rgvNwfiv0D2G4RtwFVMkhXE3Bg/XWmXjKiBp4z+UFNHeoXp9WeFkVtJNlC+kbJmnWiW1TgLSGo8cj+eQlA5Qe3R3uQIrsKmX084/Gipgc=</go:docsCustomData>
-</go:gDocsCustomXmlDataStorage>
-</file>
-
-<file path=customXml/item2.xml><?xml version="1.0" encoding="utf-8"?>
-<p:properties xmlns:p="http://schemas.microsoft.com/office/2006/metadata/properties" xmlns:xsi="http://www.w3.org/2001/XMLSchema-instance" xmlns:pc="http://schemas.microsoft.com/office/infopath/2007/PartnerControls">
-  <documentManagement/>
-</p:properties>
-</file>
-
-<file path=customXml/item3.xml><?xml version="1.0" encoding="utf-8"?>
-<?mso-contentType ?>
-<FormTemplates xmlns="http://schemas.microsoft.com/sharepoint/v3/contenttype/forms">
-  <Display>DocumentLibraryForm</Display>
-  <Edit>DocumentLibraryForm</Edit>
-  <New>DocumentLibraryForm</New>
-</FormTemplates>
-</file>
-
-<file path=customXml/item4.xml><?xml version="1.0" encoding="utf-8"?>
 <ct:contentTypeSchema xmlns:ct="http://schemas.microsoft.com/office/2006/metadata/contentType" xmlns:ma="http://schemas.microsoft.com/office/2006/metadata/properties/metaAttributes" ct:_="" ma:_="" ma:contentTypeName="Document" ma:contentTypeID="0x010100E1658AE02BC68C42957638751670C2B7" ma:contentTypeVersion="7" ma:contentTypeDescription="Create a new document." ma:contentTypeScope="" ma:versionID="e923e13f3d3d89c9bd27de48cda603b4">
   <xsd:schema xmlns:xsd="http://www.w3.org/2001/XMLSchema" xmlns:xs="http://www.w3.org/2001/XMLSchema" xmlns:p="http://schemas.microsoft.com/office/2006/metadata/properties" xmlns:ns2="a0539b10-29a5-407b-abc2-e1eaee899d9c" targetNamespace="http://schemas.microsoft.com/office/2006/metadata/properties" ma:root="true" ma:fieldsID="484c045248e082d495d79d3876fce541" ns2:_="">
     <xsd:import namespace="a0539b10-29a5-407b-abc2-e1eaee899d9c"/>
@@ -12648,33 +13907,28 @@
 </ct:contentTypeSchema>
 </file>
 
-<file path=customXml/itemProps1.xml><?xml version="1.0" encoding="utf-8"?>
-<ds:datastoreItem xmlns:ds="http://schemas.openxmlformats.org/officeDocument/2006/customXml" ds:itemID="{11111111-1234-1234-1234-123412341234}">
-  <ds:schemaRefs>
-    <ds:schemaRef ds:uri="http://customooxmlschemas.google.com/"/>
-    <ds:schemaRef ds:uri="http://schemas.openxmlformats.org/officeDocument/2006/relationships"/>
-  </ds:schemaRefs>
-</ds:datastoreItem>
+<file path=customXml/item2.xml><?xml version="1.0" encoding="utf-8"?>
+<?mso-contentType ?>
+<FormTemplates xmlns="http://schemas.microsoft.com/sharepoint/v3/contenttype/forms">
+  <Display>DocumentLibraryForm</Display>
+  <Edit>DocumentLibraryForm</Edit>
+  <New>DocumentLibraryForm</New>
+</FormTemplates>
 </file>
 
-<file path=customXml/itemProps2.xml><?xml version="1.0" encoding="utf-8"?>
-<ds:datastoreItem xmlns:ds="http://schemas.openxmlformats.org/officeDocument/2006/customXml" ds:itemID="{3B1A1A3D-7EFE-48CF-A545-CCD3A43B4D3D}">
-  <ds:schemaRefs>
-    <ds:schemaRef ds:uri="http://schemas.microsoft.com/office/2006/metadata/properties"/>
-    <ds:schemaRef ds:uri="http://schemas.microsoft.com/office/infopath/2007/PartnerControls"/>
-  </ds:schemaRefs>
-</ds:datastoreItem>
+<file path=customXml/item3.xml><?xml version="1.0" encoding="utf-8"?>
+<p:properties xmlns:p="http://schemas.microsoft.com/office/2006/metadata/properties" xmlns:xsi="http://www.w3.org/2001/XMLSchema-instance" xmlns:pc="http://schemas.microsoft.com/office/infopath/2007/PartnerControls">
+  <documentManagement/>
+</p:properties>
 </file>
 
-<file path=customXml/itemProps3.xml><?xml version="1.0" encoding="utf-8"?>
-<ds:datastoreItem xmlns:ds="http://schemas.openxmlformats.org/officeDocument/2006/customXml" ds:itemID="{382589FA-7B25-4FB3-A9A3-E15A8A1FB3F9}">
-  <ds:schemaRefs>
-    <ds:schemaRef ds:uri="http://schemas.microsoft.com/sharepoint/v3/contenttype/forms"/>
-  </ds:schemaRefs>
-</ds:datastoreItem>
+<file path=customXml/item4.xml><?xml version="1.0" encoding="utf-8"?>
+<go:gDocsCustomXmlDataStorage xmlns:go="http://customooxmlschemas.google.com/" xmlns:r="http://schemas.openxmlformats.org/officeDocument/2006/relationships" uri="GoogleDocsCustomDataVersion1">
+  <go:docsCustomData xmlns:go="http://customooxmlschemas.google.com/" roundtripDataSignature="AMtx7mies+KBQbqO1iLlLUC8NQ1ta8vRTQ==">AMUW2mVs91az8wa1tjm0QuJxat9wiYJvCE5l2c3ZtOgRcqmj6KNfXwWnccCntETrU90rhxEpw4L3w6Zii+U5aW44abjebAqjlcyJmWwABHJKFIWZadReDhDtwf7BJ4rJ/UUWC5qmDni84eztB5aXZWckKJ34i/sTJuk8I4m+pB6KQ+wP5O1MafGlLD3SKH8h3c25oMDKqWYme+rgvNwfiv0D2G4RtwFVMkhXE3Bg/XWmXjKiBp4z+UFNHeoXp9WeFkVtJNlC+kbJmnWiW1TgLSGo8cj+eQlA5Qe3R3uQIrsKmX084/Gipgc=</go:docsCustomData>
+</go:gDocsCustomXmlDataStorage>
 </file>
 
-<file path=customXml/itemProps4.xml><?xml version="1.0" encoding="utf-8"?>
+<file path=customXml/itemProps1.xml><?xml version="1.0" encoding="utf-8"?>
 <ds:datastoreItem xmlns:ds="http://schemas.openxmlformats.org/officeDocument/2006/customXml" ds:itemID="{00FEC43D-C781-4A44-952D-C70B87A3838B}">
   <ds:schemaRefs>
     <ds:schemaRef ds:uri="http://schemas.microsoft.com/office/2006/metadata/contentType"/>
@@ -12690,4 +13944,30 @@
     <ds:schemaRef ds:uri="http://schemas.microsoft.com/internal/obd"/>
   </ds:schemaRefs>
 </ds:datastoreItem>
+</file>
+
+<file path=customXml/itemProps2.xml><?xml version="1.0" encoding="utf-8"?>
+<ds:datastoreItem xmlns:ds="http://schemas.openxmlformats.org/officeDocument/2006/customXml" ds:itemID="{382589FA-7B25-4FB3-A9A3-E15A8A1FB3F9}">
+  <ds:schemaRefs>
+    <ds:schemaRef ds:uri="http://schemas.microsoft.com/sharepoint/v3/contenttype/forms"/>
+  </ds:schemaRefs>
+</ds:datastoreItem>
+</file>
+
+<file path=customXml/itemProps3.xml><?xml version="1.0" encoding="utf-8"?>
+<ds:datastoreItem xmlns:ds="http://schemas.openxmlformats.org/officeDocument/2006/customXml" ds:itemID="{3B1A1A3D-7EFE-48CF-A545-CCD3A43B4D3D}">
+  <ds:schemaRefs>
+    <ds:schemaRef ds:uri="http://schemas.microsoft.com/office/2006/metadata/properties"/>
+    <ds:schemaRef ds:uri="http://schemas.microsoft.com/office/infopath/2007/PartnerControls"/>
+  </ds:schemaRefs>
+</ds:datastoreItem>
+</file>
+
+<file path=customXml/itemProps4.xml><?xml version="1.0" encoding="utf-8"?>
+<ds:datastoreItem xmlns:ds="http://schemas.openxmlformats.org/officeDocument/2006/customXml" ds:itemID="{11111111-1234-1234-1234-123412341234}">
+  <ds:schemaRefs>
+    <ds:schemaRef ds:uri="http://customooxmlschemas.google.com/"/>
+    <ds:schemaRef ds:uri="http://schemas.openxmlformats.org/officeDocument/2006/relationships"/>
+  </ds:schemaRefs>
+</ds:datastoreItem>
 </file>
</xml_diff>